<commit_message>
Save Master Questions progress
</commit_message>
<xml_diff>
--- a/DM2026-Lab1-Master-Questions.docx
+++ b/DM2026-Lab1-Master-Questions.docx
@@ -195,6 +195,30 @@
         </w:rPr>
         <w:t>English Name:</w:t>
       </w:r>
+      <w:r>
+        <w:rPr>
+          <w:rFonts w:ascii="Century Schoolbook" w:hAnsi="Century Schoolbook" w:hint="eastAsia"/>
+          <w:b/>
+          <w:bCs/>
+        </w:rPr>
+        <w:t xml:space="preserve"> CHUANG</w:t>
+      </w:r>
+      <w:r>
+        <w:rPr>
+          <w:rFonts w:ascii="Century Schoolbook" w:hAnsi="Century Schoolbook" w:hint="eastAsia"/>
+          <w:b/>
+          <w:bCs/>
+        </w:rPr>
+        <w:t xml:space="preserve">　</w:t>
+      </w:r>
+      <w:r>
+        <w:rPr>
+          <w:rFonts w:ascii="Century Schoolbook" w:hAnsi="Century Schoolbook" w:hint="eastAsia"/>
+          <w:b/>
+          <w:bCs/>
+        </w:rPr>
+        <w:t>TSAI_WEI</w:t>
+      </w:r>
     </w:p>
     <w:p>
       <w:pPr>
@@ -215,6 +239,22 @@
         </w:rPr>
         <w:t>Chinese Name:</w:t>
       </w:r>
+      <w:r>
+        <w:rPr>
+          <w:rFonts w:ascii="Century Schoolbook" w:hAnsi="Century Schoolbook" w:hint="eastAsia"/>
+          <w:b/>
+          <w:bCs/>
+        </w:rPr>
+        <w:t xml:space="preserve"> </w:t>
+      </w:r>
+      <w:r>
+        <w:rPr>
+          <w:rFonts w:ascii="Century Schoolbook" w:hAnsi="Century Schoolbook" w:hint="eastAsia"/>
+          <w:b/>
+          <w:bCs/>
+        </w:rPr>
+        <w:t>莊財瑋</w:t>
+      </w:r>
     </w:p>
     <w:p>
       <w:pPr>
@@ -235,6 +275,14 @@
         </w:rPr>
         <w:t>Email:</w:t>
       </w:r>
+      <w:r>
+        <w:rPr>
+          <w:rFonts w:ascii="Century Schoolbook" w:hAnsi="Century Schoolbook" w:hint="eastAsia"/>
+          <w:b/>
+          <w:bCs/>
+        </w:rPr>
+        <w:t xml:space="preserve"> s115321528@mail2.ncnu.edu.tw</w:t>
+      </w:r>
     </w:p>
     <w:p>
       <w:pPr>
@@ -255,6 +303,14 @@
         </w:rPr>
         <w:t>Student ID:</w:t>
       </w:r>
+      <w:r>
+        <w:rPr>
+          <w:rFonts w:ascii="Century Schoolbook" w:hAnsi="Century Schoolbook" w:hint="eastAsia"/>
+          <w:b/>
+          <w:bCs/>
+        </w:rPr>
+        <w:t xml:space="preserve"> 115321528</w:t>
+      </w:r>
     </w:p>
     <w:p>
       <w:pPr>
@@ -275,6 +331,14 @@
         </w:rPr>
         <w:t>University:</w:t>
       </w:r>
+      <w:r>
+        <w:rPr>
+          <w:rFonts w:ascii="Century Schoolbook" w:hAnsi="Century Schoolbook" w:hint="eastAsia"/>
+          <w:b/>
+          <w:bCs/>
+        </w:rPr>
+        <w:t xml:space="preserve"> NCNU</w:t>
+      </w:r>
     </w:p>
     <w:p>
       <w:pPr>
@@ -449,35 +513,7 @@
         <w:rPr>
           <w:rFonts w:ascii="Century Schoolbook" w:hAnsi="Century Schoolbook"/>
         </w:rPr>
-        <w:t xml:space="preserve">Read the task; change parameters when asked (e.g. </w:t>
-      </w:r>
-      <w:proofErr w:type="spellStart"/>
-      <w:r>
-        <w:rPr>
-          <w:rFonts w:ascii="Century Schoolbook" w:hAnsi="Century Schoolbook"/>
-        </w:rPr>
-        <w:t>stop_words</w:t>
-      </w:r>
-      <w:proofErr w:type="spellEnd"/>
-      <w:r>
-        <w:rPr>
-          <w:rFonts w:ascii="Century Schoolbook" w:hAnsi="Century Schoolbook"/>
-        </w:rPr>
-        <w:t xml:space="preserve">, thresholds, k, </w:t>
-      </w:r>
-      <w:proofErr w:type="spellStart"/>
-      <w:r>
-        <w:rPr>
-          <w:rFonts w:ascii="Century Schoolbook" w:hAnsi="Century Schoolbook"/>
-        </w:rPr>
-        <w:t>minSup</w:t>
-      </w:r>
-      <w:proofErr w:type="spellEnd"/>
-      <w:r>
-        <w:rPr>
-          <w:rFonts w:ascii="Century Schoolbook" w:hAnsi="Century Schoolbook"/>
-        </w:rPr>
-        <w:t>).</w:t>
+        <w:t>Read the task; change parameters when asked (e.g. stop_words, thresholds, k, minSup).</w:t>
       </w:r>
     </w:p>
     <w:p>
@@ -937,7 +973,7 @@
     </w:p>
     <w:p>
       <w:pPr>
-        <w:pStyle w:val="ListParagraph"/>
+        <w:pStyle w:val="a9"/>
         <w:numPr>
           <w:ilvl w:val="0"/>
           <w:numId w:val="15"/>
@@ -978,16 +1014,16 @@
     </w:p>
     <w:p>
       <w:pPr>
-        <w:pStyle w:val="ListParagraph"/>
-        <w:jc w:val="both"/>
-        <w:rPr>
-          <w:rFonts w:ascii="Century Schoolbook" w:hAnsi="Century Schoolbook"/>
-        </w:rPr>
-      </w:pPr>
-    </w:p>
-    <w:p>
-      <w:pPr>
-        <w:pStyle w:val="ListParagraph"/>
+        <w:pStyle w:val="a9"/>
+        <w:jc w:val="both"/>
+        <w:rPr>
+          <w:rFonts w:ascii="Century Schoolbook" w:hAnsi="Century Schoolbook"/>
+        </w:rPr>
+      </w:pPr>
+    </w:p>
+    <w:p>
+      <w:pPr>
+        <w:pStyle w:val="a9"/>
         <w:numPr>
           <w:ilvl w:val="0"/>
           <w:numId w:val="15"/>
@@ -1042,16 +1078,16 @@
     </w:p>
     <w:p>
       <w:pPr>
-        <w:pStyle w:val="ListParagraph"/>
-        <w:jc w:val="both"/>
-        <w:rPr>
-          <w:rFonts w:ascii="Century Schoolbook" w:hAnsi="Century Schoolbook"/>
-        </w:rPr>
-      </w:pPr>
-    </w:p>
-    <w:p>
-      <w:pPr>
-        <w:pStyle w:val="ListParagraph"/>
+        <w:pStyle w:val="a9"/>
+        <w:jc w:val="both"/>
+        <w:rPr>
+          <w:rFonts w:ascii="Century Schoolbook" w:hAnsi="Century Schoolbook"/>
+        </w:rPr>
+      </w:pPr>
+    </w:p>
+    <w:p>
+      <w:pPr>
+        <w:pStyle w:val="a9"/>
         <w:numPr>
           <w:ilvl w:val="0"/>
           <w:numId w:val="15"/>
@@ -1380,21 +1416,7 @@
         <w:rPr>
           <w:rFonts w:ascii="Century Schoolbook" w:hAnsi="Century Schoolbook"/>
         </w:rPr>
-        <w:t xml:space="preserve"> Filter the </w:t>
-      </w:r>
-      <w:proofErr w:type="spellStart"/>
-      <w:r>
-        <w:rPr>
-          <w:rFonts w:ascii="Century Schoolbook" w:hAnsi="Century Schoolbook"/>
-        </w:rPr>
-        <w:t>dataframe</w:t>
-      </w:r>
-      <w:proofErr w:type="spellEnd"/>
-      <w:r>
-        <w:rPr>
-          <w:rFonts w:ascii="Century Schoolbook" w:hAnsi="Century Schoolbook"/>
-        </w:rPr>
-        <w:t xml:space="preserve"> </w:t>
+        <w:t xml:space="preserve"> Filter the dataframe </w:t>
       </w:r>
       <w:r>
         <w:rPr>
@@ -1410,7 +1432,6 @@
         </w:rPr>
         <w:t xml:space="preserve"> for the category </w:t>
       </w:r>
-      <w:proofErr w:type="spellStart"/>
       <w:r>
         <w:rPr>
           <w:rFonts w:ascii="Century Schoolbook" w:hAnsi="Century Schoolbook"/>
@@ -1419,7 +1440,6 @@
         </w:rPr>
         <w:t>sci.med</w:t>
       </w:r>
-      <w:proofErr w:type="spellEnd"/>
       <w:r>
         <w:rPr>
           <w:rFonts w:ascii="Century Schoolbook" w:hAnsi="Century Schoolbook"/>
@@ -1491,7 +1511,7 @@
       <w:pPr>
         <w:jc w:val="both"/>
         <w:rPr>
-          <w:rFonts w:ascii="Century Schoolbook" w:hAnsi="Century Schoolbook"/>
+          <w:rFonts w:ascii="Century Schoolbook" w:hAnsi="Century Schoolbook" w:hint="eastAsia"/>
         </w:rPr>
       </w:pPr>
       <w:r>
@@ -1502,6 +1522,22 @@
         </w:rPr>
         <w:t>Answer:</w:t>
       </w:r>
+      <w:r>
+        <w:rPr>
+          <w:rFonts w:ascii="Century Schoolbook" w:hAnsi="Century Schoolbook" w:hint="eastAsia"/>
+          <w:b/>
+          <w:bCs/>
+        </w:rPr>
+        <w:t xml:space="preserve"> </w:t>
+      </w:r>
+      <w:r>
+        <w:rPr>
+          <w:rFonts w:ascii="Century Schoolbook" w:hAnsi="Century Schoolbook"/>
+          <w:b/>
+          <w:bCs/>
+        </w:rPr>
+        <w:t>594 documents.</w:t>
+      </w:r>
     </w:p>
     <w:p>
       <w:pPr>
@@ -1522,7 +1558,7 @@
         <w:rPr>
           <w:rFonts w:ascii="Century Schoolbook" w:hAnsi="Century Schoolbook"/>
         </w:rPr>
-        <w:t xml:space="preserve"> Yes / No </w:t>
+        <w:t xml:space="preserve"> Yes </w:t>
       </w:r>
     </w:p>
     <w:p>
@@ -1546,6 +1582,12 @@
         </w:rPr>
         <w:t xml:space="preserve"> </w:t>
       </w:r>
+      <w:r>
+        <w:rPr>
+          <w:rFonts w:ascii="Century Schoolbook" w:hAnsi="Century Schoolbook"/>
+        </w:rPr>
+        <w:t>AI was used to explain data filtering concepts, troubleshoot Python errors, and provide guidance on English writing.</w:t>
+      </w:r>
     </w:p>
     <w:p>
       <w:pPr>
@@ -1568,6 +1610,29 @@
         </w:rPr>
         <w:t xml:space="preserve"> </w:t>
       </w:r>
+      <w:hyperlink r:id="rId7" w:history="1">
+        <w:r>
+          <w:rPr>
+            <w:rStyle w:val="af2"/>
+            <w:rFonts w:ascii="Century Schoolbook" w:hAnsi="Century Schoolbook"/>
+          </w:rPr>
+          <w:t>Pandas — Boole</w:t>
+        </w:r>
+        <w:r>
+          <w:rPr>
+            <w:rStyle w:val="af2"/>
+            <w:rFonts w:ascii="Century Schoolbook" w:hAnsi="Century Schoolbook"/>
+          </w:rPr>
+          <w:t>a</w:t>
+        </w:r>
+        <w:r>
+          <w:rPr>
+            <w:rStyle w:val="af2"/>
+            <w:rFonts w:ascii="Century Schoolbook" w:hAnsi="Century Schoolbook"/>
+          </w:rPr>
+          <w:t>n Indexing</w:t>
+        </w:r>
+      </w:hyperlink>
     </w:p>
     <w:p>
       <w:pPr>
@@ -1676,7 +1741,6 @@
         </w:rPr>
         <w:t xml:space="preserve">In Section 4.1, a dummy record with a missing value is injected and then removed using the </w:t>
       </w:r>
-      <w:proofErr w:type="spellStart"/>
       <w:proofErr w:type="gramStart"/>
       <w:r>
         <w:rPr>
@@ -1684,16 +1748,7 @@
           <w:b/>
           <w:bCs/>
         </w:rPr>
-        <w:t>dropna</w:t>
-      </w:r>
-      <w:proofErr w:type="spellEnd"/>
-      <w:r>
-        <w:rPr>
-          <w:rFonts w:ascii="Century Schoolbook" w:hAnsi="Century Schoolbook"/>
-          <w:b/>
-          <w:bCs/>
-        </w:rPr>
-        <w:t>(</w:t>
+        <w:t>dropna(</w:t>
       </w:r>
       <w:proofErr w:type="gramEnd"/>
       <w:r>
@@ -1732,7 +1787,6 @@
         </w:rPr>
         <w:t xml:space="preserve"> If 40% of documents were missing the </w:t>
       </w:r>
-      <w:proofErr w:type="spellStart"/>
       <w:r>
         <w:rPr>
           <w:rFonts w:ascii="Century Schoolbook" w:hAnsi="Century Schoolbook"/>
@@ -1741,7 +1795,6 @@
         </w:rPr>
         <w:t>category_name</w:t>
       </w:r>
-      <w:proofErr w:type="spellEnd"/>
       <w:r>
         <w:rPr>
           <w:rFonts w:ascii="Century Schoolbook" w:hAnsi="Century Schoolbook"/>
@@ -1754,7 +1807,6 @@
         </w:rPr>
         <w:t xml:space="preserve">with </w:t>
       </w:r>
-      <w:proofErr w:type="spellStart"/>
       <w:proofErr w:type="gramStart"/>
       <w:r>
         <w:rPr>
@@ -1762,16 +1814,7 @@
           <w:b/>
           <w:bCs/>
         </w:rPr>
-        <w:t>dropna</w:t>
-      </w:r>
-      <w:proofErr w:type="spellEnd"/>
-      <w:r>
-        <w:rPr>
-          <w:rFonts w:ascii="Century Schoolbook" w:hAnsi="Century Schoolbook"/>
-          <w:b/>
-          <w:bCs/>
-        </w:rPr>
-        <w:t>(</w:t>
+        <w:t>dropna(</w:t>
       </w:r>
       <w:proofErr w:type="gramEnd"/>
       <w:r>
@@ -1799,7 +1842,7 @@
       <w:pPr>
         <w:jc w:val="both"/>
         <w:rPr>
-          <w:rFonts w:ascii="Century Schoolbook" w:hAnsi="Century Schoolbook"/>
+          <w:rFonts w:ascii="Century Schoolbook" w:hAnsi="Century Schoolbook" w:hint="eastAsia"/>
         </w:rPr>
       </w:pPr>
       <w:r>
@@ -1810,6 +1853,22 @@
         </w:rPr>
         <w:t>Answer:</w:t>
       </w:r>
+      <w:r>
+        <w:rPr>
+          <w:rFonts w:ascii="Century Schoolbook" w:hAnsi="Century Schoolbook" w:hint="eastAsia"/>
+          <w:b/>
+          <w:bCs/>
+        </w:rPr>
+        <w:t xml:space="preserve"> </w:t>
+      </w:r>
+      <w:r>
+        <w:rPr>
+          <w:rFonts w:ascii="Century Schoolbook" w:hAnsi="Century Schoolbook"/>
+          <w:b/>
+          <w:bCs/>
+        </w:rPr>
+        <w:t>Unsupervised Learning</w:t>
+      </w:r>
     </w:p>
     <w:p>
       <w:pPr>
@@ -1854,6 +1913,12 @@
         </w:rPr>
         <w:t xml:space="preserve"> </w:t>
       </w:r>
+      <w:r>
+        <w:rPr>
+          <w:rFonts w:ascii="Century Schoolbook" w:hAnsi="Century Schoolbook"/>
+        </w:rPr>
+        <w:t>AI was used to explain missing-data handling, selection bias, and alternative unsupervised learning methods.</w:t>
+      </w:r>
     </w:p>
     <w:p>
       <w:pPr>
@@ -1870,89 +1935,98 @@
         </w:rPr>
         <w:t>External references (links):</w:t>
       </w:r>
-      <w:r>
-        <w:rPr>
-          <w:rFonts w:ascii="Century Schoolbook" w:hAnsi="Century Schoolbook"/>
-        </w:rPr>
-        <w:t xml:space="preserve"> </w:t>
-      </w:r>
-    </w:p>
-    <w:p>
-      <w:pPr>
-        <w:jc w:val="both"/>
-        <w:rPr>
-          <w:rFonts w:ascii="Century Schoolbook" w:hAnsi="Century Schoolbook"/>
-        </w:rPr>
-      </w:pPr>
-    </w:p>
-    <w:p>
-      <w:pPr>
-        <w:jc w:val="both"/>
-        <w:rPr>
-          <w:rFonts w:ascii="Century Schoolbook" w:hAnsi="Century Schoolbook"/>
-        </w:rPr>
-      </w:pPr>
-    </w:p>
-    <w:p>
-      <w:pPr>
-        <w:jc w:val="both"/>
-        <w:rPr>
-          <w:rFonts w:ascii="Century Schoolbook" w:hAnsi="Century Schoolbook"/>
-        </w:rPr>
-      </w:pPr>
-    </w:p>
-    <w:p>
-      <w:pPr>
-        <w:jc w:val="both"/>
-        <w:rPr>
-          <w:rFonts w:ascii="Century Schoolbook" w:hAnsi="Century Schoolbook"/>
-        </w:rPr>
-      </w:pPr>
-    </w:p>
-    <w:p>
-      <w:pPr>
-        <w:jc w:val="both"/>
-        <w:rPr>
-          <w:rFonts w:ascii="Century Schoolbook" w:hAnsi="Century Schoolbook"/>
-        </w:rPr>
-      </w:pPr>
-    </w:p>
-    <w:p>
-      <w:pPr>
-        <w:jc w:val="both"/>
-        <w:rPr>
-          <w:rFonts w:ascii="Century Schoolbook" w:hAnsi="Century Schoolbook"/>
-        </w:rPr>
-      </w:pPr>
-    </w:p>
-    <w:p>
-      <w:pPr>
-        <w:jc w:val="both"/>
-        <w:rPr>
-          <w:rFonts w:ascii="Century Schoolbook" w:hAnsi="Century Schoolbook"/>
-        </w:rPr>
-      </w:pPr>
-    </w:p>
-    <w:p>
-      <w:pPr>
-        <w:jc w:val="both"/>
-        <w:rPr>
-          <w:rFonts w:ascii="Century Schoolbook" w:hAnsi="Century Schoolbook"/>
-        </w:rPr>
-      </w:pPr>
-    </w:p>
-    <w:p>
-      <w:pPr>
-        <w:jc w:val="both"/>
-        <w:rPr>
-          <w:rFonts w:ascii="Century Schoolbook" w:hAnsi="Century Schoolbook"/>
-        </w:rPr>
-      </w:pPr>
-      <w:r>
-        <w:rPr>
-          <w:rFonts w:ascii="Century Schoolbook" w:hAnsi="Century Schoolbook"/>
-        </w:rPr>
-        <w:lastRenderedPageBreak/>
+      <w:hyperlink r:id="rId8" w:history="1">
+        <w:r>
+          <w:rPr>
+            <w:rStyle w:val="af2"/>
+            <w:rFonts w:ascii="Century Schoolbook" w:hAnsi="Century Schoolbook"/>
+          </w:rPr>
+          <w:t xml:space="preserve"> </w:t>
+        </w:r>
+        <w:r>
+          <w:rPr>
+            <w:rStyle w:val="af2"/>
+            <w:rFonts w:ascii="Century Schoolbook" w:hAnsi="Century Schoolbook"/>
+          </w:rPr>
+          <w:t>Pandas — DataFrame.dropna()</w:t>
+        </w:r>
+      </w:hyperlink>
+    </w:p>
+    <w:p>
+      <w:pPr>
+        <w:jc w:val="both"/>
+        <w:rPr>
+          <w:rFonts w:ascii="Century Schoolbook" w:hAnsi="Century Schoolbook"/>
+        </w:rPr>
+      </w:pPr>
+    </w:p>
+    <w:p>
+      <w:pPr>
+        <w:jc w:val="both"/>
+        <w:rPr>
+          <w:rFonts w:ascii="Century Schoolbook" w:hAnsi="Century Schoolbook"/>
+        </w:rPr>
+      </w:pPr>
+    </w:p>
+    <w:p>
+      <w:pPr>
+        <w:jc w:val="both"/>
+        <w:rPr>
+          <w:rFonts w:ascii="Century Schoolbook" w:hAnsi="Century Schoolbook"/>
+        </w:rPr>
+      </w:pPr>
+    </w:p>
+    <w:p>
+      <w:pPr>
+        <w:jc w:val="both"/>
+        <w:rPr>
+          <w:rFonts w:ascii="Century Schoolbook" w:hAnsi="Century Schoolbook"/>
+        </w:rPr>
+      </w:pPr>
+    </w:p>
+    <w:p>
+      <w:pPr>
+        <w:jc w:val="both"/>
+        <w:rPr>
+          <w:rFonts w:ascii="Century Schoolbook" w:hAnsi="Century Schoolbook"/>
+        </w:rPr>
+      </w:pPr>
+    </w:p>
+    <w:p>
+      <w:pPr>
+        <w:jc w:val="both"/>
+        <w:rPr>
+          <w:rFonts w:ascii="Century Schoolbook" w:hAnsi="Century Schoolbook"/>
+        </w:rPr>
+      </w:pPr>
+    </w:p>
+    <w:p>
+      <w:pPr>
+        <w:jc w:val="both"/>
+        <w:rPr>
+          <w:rFonts w:ascii="Century Schoolbook" w:hAnsi="Century Schoolbook"/>
+        </w:rPr>
+      </w:pPr>
+    </w:p>
+    <w:p>
+      <w:pPr>
+        <w:jc w:val="both"/>
+        <w:rPr>
+          <w:rFonts w:ascii="Century Schoolbook" w:hAnsi="Century Schoolbook"/>
+        </w:rPr>
+      </w:pPr>
+    </w:p>
+    <w:p>
+      <w:pPr>
+        <w:jc w:val="both"/>
+        <w:rPr>
+          <w:rFonts w:ascii="Century Schoolbook" w:hAnsi="Century Schoolbook"/>
+        </w:rPr>
+      </w:pPr>
+      <w:r>
+        <w:rPr>
+          <w:rFonts w:ascii="Century Schoolbook" w:hAnsi="Century Schoolbook"/>
+        </w:rPr>
         <w:pict w14:anchorId="4353243F">
           <v:rect id="_x0000_i1029" style="width:0;height:1.5pt" o:hralign="center" o:hrstd="t" o:hr="t" fillcolor="#a0a0a0" stroked="f"/>
         </w:pict>
@@ -2025,41 +2099,13 @@
         </w:rPr>
         <w:t xml:space="preserve">In Section 5.1, the code uses </w:t>
       </w:r>
-      <w:proofErr w:type="spellStart"/>
-      <w:r>
-        <w:rPr>
-          <w:rFonts w:ascii="Century Schoolbook" w:hAnsi="Century Schoolbook"/>
-          <w:b/>
-          <w:bCs/>
-        </w:rPr>
-        <w:t>X_sample</w:t>
-      </w:r>
-      <w:proofErr w:type="spellEnd"/>
-      <w:r>
-        <w:rPr>
-          <w:rFonts w:ascii="Century Schoolbook" w:hAnsi="Century Schoolbook"/>
-          <w:b/>
-          <w:bCs/>
-        </w:rPr>
-        <w:t xml:space="preserve"> = </w:t>
-      </w:r>
-      <w:proofErr w:type="spellStart"/>
-      <w:r>
-        <w:rPr>
-          <w:rFonts w:ascii="Century Schoolbook" w:hAnsi="Century Schoolbook"/>
-          <w:b/>
-          <w:bCs/>
-        </w:rPr>
-        <w:t>X.sample</w:t>
-      </w:r>
-      <w:proofErr w:type="spellEnd"/>
-      <w:r>
-        <w:rPr>
-          <w:rFonts w:ascii="Century Schoolbook" w:hAnsi="Century Schoolbook"/>
-          <w:b/>
-          <w:bCs/>
-        </w:rPr>
-        <w:t>(n=1000)</w:t>
+      <w:r>
+        <w:rPr>
+          <w:rFonts w:ascii="Century Schoolbook" w:hAnsi="Century Schoolbook"/>
+          <w:b/>
+          <w:bCs/>
+        </w:rPr>
+        <w:t>X_sample = X.sample(n=1000)</w:t>
       </w:r>
       <w:r>
         <w:rPr>
@@ -2126,16 +2172,84 @@
       <w:pPr>
         <w:jc w:val="both"/>
         <w:rPr>
-          <w:rFonts w:ascii="Century Schoolbook" w:hAnsi="Century Schoolbook"/>
-        </w:rPr>
-      </w:pPr>
-      <w:r>
-        <w:rPr>
-          <w:rFonts w:ascii="Century Schoolbook" w:hAnsi="Century Schoolbook"/>
-          <w:b/>
-          <w:bCs/>
-        </w:rPr>
-        <w:t>Answer:</w:t>
+          <w:rFonts w:ascii="Century Schoolbook" w:hAnsi="Century Schoolbook" w:hint="eastAsia"/>
+        </w:rPr>
+      </w:pPr>
+      <w:r>
+        <w:rPr>
+          <w:rFonts w:ascii="Century Schoolbook" w:hAnsi="Century Schoolbook"/>
+          <w:b/>
+          <w:bCs/>
+        </w:rPr>
+        <w:t>Answer</w:t>
+      </w:r>
+      <w:proofErr w:type="gramStart"/>
+      <w:r>
+        <w:rPr>
+          <w:rFonts w:ascii="Century Schoolbook" w:hAnsi="Century Schoolbook"/>
+          <w:b/>
+          <w:bCs/>
+        </w:rPr>
+        <w:t>:</w:t>
+      </w:r>
+      <w:r>
+        <w:t xml:space="preserve"> </w:t>
+      </w:r>
+      <w:r>
+        <w:rPr>
+          <w:rFonts w:hint="eastAsia"/>
+        </w:rPr>
+        <w:t xml:space="preserve"> 1</w:t>
+      </w:r>
+      <w:proofErr w:type="gramEnd"/>
+      <w:r>
+        <w:rPr>
+          <w:rFonts w:hint="eastAsia"/>
+        </w:rPr>
+        <w:t xml:space="preserve">. </w:t>
+      </w:r>
+      <w:r>
+        <w:rPr>
+          <w:rFonts w:ascii="Century Schoolbook" w:hAnsi="Century Schoolbook"/>
+          <w:b/>
+          <w:bCs/>
+        </w:rPr>
+        <w:t>No, not exactly.</w:t>
+      </w:r>
+      <w:r>
+        <w:rPr>
+          <w:rFonts w:ascii="Century Schoolbook" w:hAnsi="Century Schoolbook" w:hint="eastAsia"/>
+          <w:b/>
+          <w:bCs/>
+        </w:rPr>
+        <w:t xml:space="preserve">  2.</w:t>
+      </w:r>
+      <w:r>
+        <w:t xml:space="preserve"> </w:t>
+      </w:r>
+      <w:r>
+        <w:rPr>
+          <w:rFonts w:ascii="Century Schoolbook" w:hAnsi="Century Schoolbook"/>
+          <w:b/>
+          <w:bCs/>
+        </w:rPr>
+        <w:t>Underrepresentation</w:t>
+      </w:r>
+      <w:r>
+        <w:rPr>
+          <w:rFonts w:ascii="Century Schoolbook" w:hAnsi="Century Schoolbook"/>
+          <w:b/>
+          <w:bCs/>
+        </w:rPr>
+        <w:t>、</w:t>
+      </w:r>
+      <w:r>
+        <w:rPr>
+          <w:rFonts w:ascii="Century Schoolbook" w:hAnsi="Century Schoolbook"/>
+          <w:b/>
+          <w:bCs/>
+        </w:rPr>
+        <w:t>Sampling Bias / Sampling Variability</w:t>
       </w:r>
     </w:p>
     <w:p>
@@ -2157,7 +2271,7 @@
         <w:rPr>
           <w:rFonts w:ascii="Century Schoolbook" w:hAnsi="Century Schoolbook"/>
         </w:rPr>
-        <w:t xml:space="preserve"> Yes / No </w:t>
+        <w:t xml:space="preserve"> No </w:t>
       </w:r>
     </w:p>
     <w:p>
@@ -2287,7 +2401,6 @@
         </w:rPr>
         <w:t xml:space="preserve">In Section 5.3, the </w:t>
       </w:r>
-      <w:proofErr w:type="spellStart"/>
       <w:r>
         <w:rPr>
           <w:rFonts w:ascii="Century Schoolbook" w:hAnsi="Century Schoolbook"/>
@@ -2296,48 +2409,19 @@
         </w:rPr>
         <w:t>CountVectorizer</w:t>
       </w:r>
-      <w:proofErr w:type="spellEnd"/>
       <w:r>
         <w:rPr>
           <w:rFonts w:ascii="Century Schoolbook" w:hAnsi="Century Schoolbook"/>
         </w:rPr>
         <w:t xml:space="preserve"> converts text into a document-term matrix using </w:t>
       </w:r>
-      <w:proofErr w:type="spellStart"/>
-      <w:r>
-        <w:rPr>
-          <w:rFonts w:ascii="Century Schoolbook" w:hAnsi="Century Schoolbook"/>
-          <w:b/>
-          <w:bCs/>
-        </w:rPr>
-        <w:t>stop_words</w:t>
-      </w:r>
-      <w:proofErr w:type="spellEnd"/>
-      <w:r>
-        <w:rPr>
-          <w:rFonts w:ascii="Century Schoolbook" w:hAnsi="Century Schoolbook"/>
-          <w:b/>
-          <w:bCs/>
-        </w:rPr>
-        <w:t>='</w:t>
-      </w:r>
-      <w:proofErr w:type="spellStart"/>
-      <w:r>
-        <w:rPr>
-          <w:rFonts w:ascii="Century Schoolbook" w:hAnsi="Century Schoolbook"/>
-          <w:b/>
-          <w:bCs/>
-        </w:rPr>
-        <w:t>english</w:t>
-      </w:r>
-      <w:proofErr w:type="spellEnd"/>
-      <w:r>
-        <w:rPr>
-          <w:rFonts w:ascii="Century Schoolbook" w:hAnsi="Century Schoolbook"/>
-          <w:b/>
-          <w:bCs/>
-        </w:rPr>
-        <w:t>’</w:t>
+      <w:r>
+        <w:rPr>
+          <w:rFonts w:ascii="Century Schoolbook" w:hAnsi="Century Schoolbook"/>
+          <w:b/>
+          <w:bCs/>
+        </w:rPr>
+        <w:t>stop_words='english’</w:t>
       </w:r>
       <w:r>
         <w:rPr>
@@ -2345,23 +2429,13 @@
         </w:rPr>
         <w:t xml:space="preserve">. Change this parameter to </w:t>
       </w:r>
-      <w:proofErr w:type="spellStart"/>
-      <w:r>
-        <w:rPr>
-          <w:rFonts w:ascii="Century Schoolbook" w:hAnsi="Century Schoolbook"/>
-          <w:b/>
-          <w:bCs/>
-        </w:rPr>
-        <w:t>stop_words</w:t>
-      </w:r>
-      <w:proofErr w:type="spellEnd"/>
-      <w:r>
-        <w:rPr>
-          <w:rFonts w:ascii="Century Schoolbook" w:hAnsi="Century Schoolbook"/>
-          <w:b/>
-          <w:bCs/>
-        </w:rPr>
-        <w:t>=None</w:t>
+      <w:r>
+        <w:rPr>
+          <w:rFonts w:ascii="Century Schoolbook" w:hAnsi="Century Schoolbook"/>
+          <w:b/>
+          <w:bCs/>
+        </w:rPr>
+        <w:t>stop_words=None</w:t>
       </w:r>
       <w:r>
         <w:rPr>
@@ -2369,7 +2443,6 @@
         </w:rPr>
         <w:t xml:space="preserve"> and re-run the cell to check the shape of </w:t>
       </w:r>
-      <w:proofErr w:type="spellStart"/>
       <w:r>
         <w:rPr>
           <w:rFonts w:ascii="Century Schoolbook" w:hAnsi="Century Schoolbook"/>
@@ -2378,7 +2451,6 @@
         </w:rPr>
         <w:t>X_counts</w:t>
       </w:r>
-      <w:proofErr w:type="spellEnd"/>
       <w:r>
         <w:rPr>
           <w:rFonts w:ascii="Century Schoolbook" w:hAnsi="Century Schoolbook"/>
@@ -2457,28 +2529,14 @@
         <w:rPr>
           <w:rFonts w:ascii="Century Schoolbook" w:hAnsi="Century Schoolbook"/>
         </w:rPr>
-        <w:t xml:space="preserve">Since </w:t>
-      </w:r>
-      <w:proofErr w:type="spellStart"/>
-      <w:r>
-        <w:rPr>
-          <w:rFonts w:ascii="Century Schoolbook" w:hAnsi="Century Schoolbook"/>
-        </w:rPr>
-        <w:t>stopwords</w:t>
-      </w:r>
-      <w:proofErr w:type="spellEnd"/>
-      <w:r>
-        <w:rPr>
-          <w:rFonts w:ascii="Century Schoolbook" w:hAnsi="Century Schoolbook"/>
-        </w:rPr>
-        <w:t xml:space="preserve"> are highly common words that appear in almost all documents, what effect does adding them back have on the overall sparsity (the percentage of zeros) of the matrix?</w:t>
-      </w:r>
-    </w:p>
-    <w:p>
-      <w:pPr>
-        <w:jc w:val="both"/>
-        <w:rPr>
-          <w:rFonts w:ascii="Century Schoolbook" w:hAnsi="Century Schoolbook"/>
+        <w:t>Since stopwords are highly common words that appear in almost all documents, what effect does adding them back have on the overall sparsity (the percentage of zeros) of the matrix?</w:t>
+      </w:r>
+    </w:p>
+    <w:p>
+      <w:pPr>
+        <w:jc w:val="both"/>
+        <w:rPr>
+          <w:rFonts w:ascii="Century Schoolbook" w:hAnsi="Century Schoolbook" w:hint="eastAsia"/>
         </w:rPr>
       </w:pPr>
       <w:r>
@@ -2489,6 +2547,71 @@
         </w:rPr>
         <w:t>Answer:</w:t>
       </w:r>
+      <w:r>
+        <w:t xml:space="preserve"> </w:t>
+      </w:r>
+      <w:r>
+        <w:rPr>
+          <w:rFonts w:hint="eastAsia"/>
+        </w:rPr>
+        <w:t xml:space="preserve"> 1. </w:t>
+      </w:r>
+      <w:r>
+        <w:rPr>
+          <w:rFonts w:ascii="Century Schoolbook" w:hAnsi="Century Schoolbook"/>
+          <w:b/>
+          <w:bCs/>
+        </w:rPr>
+        <w:t>increases the number of features</w:t>
+      </w:r>
+      <w:r>
+        <w:rPr>
+          <w:rFonts w:ascii="Century Schoolbook" w:hAnsi="Century Schoolbook" w:hint="eastAsia"/>
+          <w:b/>
+          <w:bCs/>
+        </w:rPr>
+        <w:t xml:space="preserve">  2. </w:t>
+      </w:r>
+      <w:r>
+        <w:rPr>
+          <w:rFonts w:ascii="Century Schoolbook" w:hAnsi="Century Schoolbook"/>
+          <w:b/>
+          <w:bCs/>
+        </w:rPr>
+        <w:t>common stopwords appear in many documents</w:t>
+      </w:r>
+      <w:r>
+        <w:rPr>
+          <w:rFonts w:ascii="Century Schoolbook" w:hAnsi="Century Schoolbook"/>
+          <w:b/>
+          <w:bCs/>
+        </w:rPr>
+        <w:t>、</w:t>
+      </w:r>
+      <w:r>
+        <w:rPr>
+          <w:rFonts w:ascii="Century Schoolbook" w:hAnsi="Century Schoolbook"/>
+          <w:b/>
+          <w:bCs/>
+        </w:rPr>
+        <w:t>more non-zero entries</w:t>
+      </w:r>
+      <w:r>
+        <w:rPr>
+          <w:rFonts w:ascii="Century Schoolbook" w:hAnsi="Century Schoolbook"/>
+          <w:b/>
+          <w:bCs/>
+        </w:rPr>
+        <w:t>、</w:t>
+      </w:r>
+      <w:r>
+        <w:rPr>
+          <w:rFonts w:ascii="Century Schoolbook" w:hAnsi="Century Schoolbook"/>
+          <w:b/>
+          <w:bCs/>
+        </w:rPr>
+        <w:t>lower percentage of zeros</w:t>
+      </w:r>
     </w:p>
     <w:p>
       <w:pPr>
@@ -2509,7 +2632,7 @@
         <w:rPr>
           <w:rFonts w:ascii="Century Schoolbook" w:hAnsi="Century Schoolbook"/>
         </w:rPr>
-        <w:t xml:space="preserve"> Yes / No </w:t>
+        <w:t xml:space="preserve"> No </w:t>
       </w:r>
     </w:p>
     <w:p>
@@ -2576,31 +2699,7 @@
       <w:pPr>
         <w:jc w:val="both"/>
         <w:rPr>
-          <w:rFonts w:ascii="Century Schoolbook" w:hAnsi="Century Schoolbook"/>
-        </w:rPr>
-      </w:pPr>
-    </w:p>
-    <w:p>
-      <w:pPr>
-        <w:jc w:val="both"/>
-        <w:rPr>
-          <w:rFonts w:ascii="Century Schoolbook" w:hAnsi="Century Schoolbook"/>
-        </w:rPr>
-      </w:pPr>
-    </w:p>
-    <w:p>
-      <w:pPr>
-        <w:jc w:val="both"/>
-        <w:rPr>
-          <w:rFonts w:ascii="Century Schoolbook" w:hAnsi="Century Schoolbook"/>
-        </w:rPr>
-      </w:pPr>
-    </w:p>
-    <w:p>
-      <w:pPr>
-        <w:jc w:val="both"/>
-        <w:rPr>
-          <w:rFonts w:ascii="Century Schoolbook" w:hAnsi="Century Schoolbook"/>
+          <w:rFonts w:ascii="Century Schoolbook" w:hAnsi="Century Schoolbook" w:hint="eastAsia"/>
         </w:rPr>
       </w:pPr>
     </w:p>
@@ -2704,23 +2803,13 @@
         </w:rPr>
         <w:t xml:space="preserve">In the variance filtering section, re-run </w:t>
       </w:r>
-      <w:proofErr w:type="spellStart"/>
-      <w:r>
-        <w:rPr>
-          <w:rFonts w:ascii="Century Schoolbook" w:hAnsi="Century Schoolbook"/>
-          <w:b/>
-          <w:bCs/>
-        </w:rPr>
-        <w:t>variance_filter</w:t>
-      </w:r>
-      <w:proofErr w:type="spellEnd"/>
-      <w:r>
-        <w:rPr>
-          <w:rFonts w:ascii="Century Schoolbook" w:hAnsi="Century Schoolbook"/>
-          <w:b/>
-          <w:bCs/>
-        </w:rPr>
-        <w:t xml:space="preserve"> </w:t>
+      <w:r>
+        <w:rPr>
+          <w:rFonts w:ascii="Century Schoolbook" w:hAnsi="Century Schoolbook"/>
+          <w:b/>
+          <w:bCs/>
+        </w:rPr>
+        <w:t xml:space="preserve">variance_filter </w:t>
       </w:r>
       <w:r>
         <w:rPr>
@@ -2835,6 +2924,8 @@
         <w:jc w:val="both"/>
         <w:rPr>
           <w:rFonts w:ascii="Century Schoolbook" w:hAnsi="Century Schoolbook"/>
+          <w:b/>
+          <w:bCs/>
         </w:rPr>
       </w:pPr>
       <w:r>
@@ -2844,6 +2935,92 @@
           <w:bCs/>
         </w:rPr>
         <w:t>Answer:</w:t>
+      </w:r>
+      <w:r>
+        <w:rPr>
+          <w:rFonts w:ascii="Century Schoolbook" w:hAnsi="Century Schoolbook" w:hint="eastAsia"/>
+          <w:b/>
+          <w:bCs/>
+        </w:rPr>
+        <w:t xml:space="preserve"> 1.</w:t>
+      </w:r>
+      <w:r>
+        <w:t xml:space="preserve"> </w:t>
+      </w:r>
+      <w:r>
+        <w:rPr>
+          <w:rFonts w:ascii="Century Schoolbook" w:hAnsi="Century Schoolbook"/>
+          <w:b/>
+          <w:bCs/>
+        </w:rPr>
+        <w:t>The vocabulary size decreases significantly.</w:t>
+      </w:r>
+    </w:p>
+    <w:p>
+      <w:pPr>
+        <w:jc w:val="both"/>
+        <w:rPr>
+          <w:rFonts w:ascii="Century Schoolbook" w:hAnsi="Century Schoolbook"/>
+          <w:b/>
+          <w:bCs/>
+        </w:rPr>
+      </w:pPr>
+      <w:r>
+        <w:rPr>
+          <w:rFonts w:ascii="Century Schoolbook" w:hAnsi="Century Schoolbook"/>
+          <w:b/>
+          <w:bCs/>
+        </w:rPr>
+        <w:tab/>
+      </w:r>
+      <w:r>
+        <w:rPr>
+          <w:rFonts w:ascii="Century Schoolbook" w:hAnsi="Century Schoolbook" w:hint="eastAsia"/>
+          <w:b/>
+          <w:bCs/>
+        </w:rPr>
+        <w:t xml:space="preserve">     2.</w:t>
+      </w:r>
+      <w:r>
+        <w:t xml:space="preserve"> </w:t>
+      </w:r>
+      <w:r>
+        <w:rPr>
+          <w:rFonts w:ascii="Century Schoolbook" w:hAnsi="Century Schoolbook"/>
+          <w:b/>
+          <w:bCs/>
+        </w:rPr>
+        <w:t>Rare words and nearly constant words</w:t>
+      </w:r>
+    </w:p>
+    <w:p>
+      <w:pPr>
+        <w:ind w:firstLineChars="500" w:firstLine="1101"/>
+        <w:jc w:val="both"/>
+        <w:rPr>
+          <w:rFonts w:ascii="Century Schoolbook" w:hAnsi="Century Schoolbook" w:hint="eastAsia"/>
+          <w:b/>
+          <w:bCs/>
+        </w:rPr>
+      </w:pPr>
+      <w:r>
+        <w:rPr>
+          <w:rFonts w:ascii="Century Schoolbook" w:hAnsi="Century Schoolbook" w:hint="eastAsia"/>
+          <w:b/>
+          <w:bCs/>
+        </w:rPr>
+        <w:t>3.</w:t>
+      </w:r>
+      <w:r>
+        <w:t xml:space="preserve"> </w:t>
+      </w:r>
+      <w:r>
+        <w:rPr>
+          <w:rFonts w:ascii="Century Schoolbook" w:hAnsi="Century Schoolbook"/>
+          <w:b/>
+          <w:bCs/>
+        </w:rPr>
+        <w:t>It reduces dimensionality and computational cost.</w:t>
       </w:r>
     </w:p>
     <w:tbl>
@@ -2956,6 +3133,12 @@
                 <w:rFonts w:ascii="Century Schoolbook" w:hAnsi="Century Schoolbook"/>
               </w:rPr>
             </w:pPr>
+            <w:r>
+              <w:rPr>
+                <w:rFonts w:ascii="Century Schoolbook" w:hAnsi="Century Schoolbook" w:hint="eastAsia"/>
+              </w:rPr>
+              <w:t>35482</w:t>
+            </w:r>
           </w:p>
         </w:tc>
       </w:tr>
@@ -2997,6 +3180,12 @@
                 <w:rFonts w:ascii="Century Schoolbook" w:hAnsi="Century Schoolbook"/>
               </w:rPr>
             </w:pPr>
+            <w:r>
+              <w:rPr>
+                <w:rFonts w:ascii="Century Schoolbook" w:hAnsi="Century Schoolbook" w:hint="eastAsia"/>
+              </w:rPr>
+              <w:t>5089</w:t>
+            </w:r>
           </w:p>
         </w:tc>
       </w:tr>
@@ -3038,6 +3227,12 @@
                 <w:rFonts w:ascii="Century Schoolbook" w:hAnsi="Century Schoolbook"/>
               </w:rPr>
             </w:pPr>
+            <w:r>
+              <w:rPr>
+                <w:rFonts w:ascii="Century Schoolbook" w:hAnsi="Century Schoolbook" w:hint="eastAsia"/>
+              </w:rPr>
+              <w:t>1491</w:t>
+            </w:r>
           </w:p>
         </w:tc>
       </w:tr>
@@ -3061,7 +3256,7 @@
         <w:rPr>
           <w:rFonts w:ascii="Century Schoolbook" w:hAnsi="Century Schoolbook"/>
         </w:rPr>
-        <w:t xml:space="preserve"> Yes / No </w:t>
+        <w:t xml:space="preserve"> Yes </w:t>
       </w:r>
     </w:p>
     <w:p>
@@ -3085,6 +3280,12 @@
         </w:rPr>
         <w:t xml:space="preserve"> </w:t>
       </w:r>
+      <w:r>
+        <w:rPr>
+          <w:rFonts w:ascii="Century Schoolbook" w:hAnsi="Century Schoolbook"/>
+        </w:rPr>
+        <w:t>AI was used to explain variance thresholding, guide the Python experiment, and interpret the experimental results.</w:t>
+      </w:r>
     </w:p>
     <w:p>
       <w:pPr>
@@ -3107,108 +3308,93 @@
         </w:rPr>
         <w:t xml:space="preserve"> </w:t>
       </w:r>
-    </w:p>
-    <w:p>
-      <w:pPr>
-        <w:jc w:val="both"/>
-        <w:rPr>
-          <w:rFonts w:ascii="Century Schoolbook" w:hAnsi="Century Schoolbook"/>
-        </w:rPr>
-      </w:pPr>
-    </w:p>
-    <w:p>
-      <w:pPr>
-        <w:jc w:val="both"/>
-        <w:rPr>
-          <w:rFonts w:ascii="Century Schoolbook" w:hAnsi="Century Schoolbook"/>
-        </w:rPr>
-      </w:pPr>
-    </w:p>
-    <w:p>
-      <w:pPr>
-        <w:jc w:val="both"/>
-        <w:rPr>
-          <w:rFonts w:ascii="Century Schoolbook" w:hAnsi="Century Schoolbook"/>
-        </w:rPr>
-      </w:pPr>
-    </w:p>
-    <w:p>
-      <w:pPr>
-        <w:jc w:val="both"/>
-        <w:rPr>
-          <w:rFonts w:ascii="Century Schoolbook" w:hAnsi="Century Schoolbook"/>
-        </w:rPr>
-      </w:pPr>
-    </w:p>
-    <w:p>
-      <w:pPr>
-        <w:jc w:val="both"/>
-        <w:rPr>
-          <w:rFonts w:ascii="Century Schoolbook" w:hAnsi="Century Schoolbook"/>
-        </w:rPr>
-      </w:pPr>
-    </w:p>
-    <w:p>
-      <w:pPr>
-        <w:jc w:val="both"/>
-        <w:rPr>
-          <w:rFonts w:ascii="Century Schoolbook" w:hAnsi="Century Schoolbook"/>
-        </w:rPr>
-      </w:pPr>
-    </w:p>
-    <w:p>
-      <w:pPr>
-        <w:jc w:val="both"/>
-        <w:rPr>
-          <w:rFonts w:ascii="Century Schoolbook" w:hAnsi="Century Schoolbook"/>
-        </w:rPr>
-      </w:pPr>
-    </w:p>
-    <w:p>
-      <w:pPr>
-        <w:jc w:val="both"/>
-        <w:rPr>
-          <w:rFonts w:ascii="Century Schoolbook" w:hAnsi="Century Schoolbook"/>
-        </w:rPr>
-      </w:pPr>
-    </w:p>
-    <w:p>
-      <w:pPr>
-        <w:jc w:val="both"/>
-        <w:rPr>
-          <w:rFonts w:ascii="Century Schoolbook" w:hAnsi="Century Schoolbook"/>
-        </w:rPr>
-      </w:pPr>
-    </w:p>
-    <w:p>
-      <w:pPr>
-        <w:jc w:val="both"/>
-        <w:rPr>
-          <w:rFonts w:ascii="Century Schoolbook" w:hAnsi="Century Schoolbook"/>
-        </w:rPr>
-      </w:pPr>
-    </w:p>
-    <w:p>
-      <w:pPr>
-        <w:jc w:val="both"/>
-        <w:rPr>
-          <w:rFonts w:ascii="Century Schoolbook" w:hAnsi="Century Schoolbook"/>
-        </w:rPr>
-      </w:pPr>
-    </w:p>
-    <w:p>
-      <w:pPr>
-        <w:jc w:val="both"/>
-        <w:rPr>
-          <w:rFonts w:ascii="Century Schoolbook" w:hAnsi="Century Schoolbook"/>
-        </w:rPr>
-      </w:pPr>
-    </w:p>
-    <w:p>
-      <w:pPr>
-        <w:jc w:val="both"/>
-        <w:rPr>
-          <w:rFonts w:ascii="Century Schoolbook" w:hAnsi="Century Schoolbook"/>
+      <w:hyperlink r:id="rId9" w:history="1">
+        <w:r>
+          <w:rPr>
+            <w:rStyle w:val="af2"/>
+            <w:rFonts w:ascii="Century Schoolbook" w:hAnsi="Century Schoolbook"/>
+          </w:rPr>
+          <w:t>Scikit-learn — VarianceThreshold</w:t>
+        </w:r>
+      </w:hyperlink>
+    </w:p>
+    <w:p>
+      <w:pPr>
+        <w:jc w:val="both"/>
+        <w:rPr>
+          <w:rFonts w:ascii="Century Schoolbook" w:hAnsi="Century Schoolbook"/>
+        </w:rPr>
+      </w:pPr>
+    </w:p>
+    <w:p>
+      <w:pPr>
+        <w:jc w:val="both"/>
+        <w:rPr>
+          <w:rFonts w:ascii="Century Schoolbook" w:hAnsi="Century Schoolbook"/>
+        </w:rPr>
+      </w:pPr>
+    </w:p>
+    <w:p>
+      <w:pPr>
+        <w:jc w:val="both"/>
+        <w:rPr>
+          <w:rFonts w:ascii="Century Schoolbook" w:hAnsi="Century Schoolbook"/>
+        </w:rPr>
+      </w:pPr>
+    </w:p>
+    <w:p>
+      <w:pPr>
+        <w:jc w:val="both"/>
+        <w:rPr>
+          <w:rFonts w:ascii="Century Schoolbook" w:hAnsi="Century Schoolbook"/>
+        </w:rPr>
+      </w:pPr>
+    </w:p>
+    <w:p>
+      <w:pPr>
+        <w:jc w:val="both"/>
+        <w:rPr>
+          <w:rFonts w:ascii="Century Schoolbook" w:hAnsi="Century Schoolbook"/>
+        </w:rPr>
+      </w:pPr>
+    </w:p>
+    <w:p>
+      <w:pPr>
+        <w:jc w:val="both"/>
+        <w:rPr>
+          <w:rFonts w:ascii="Century Schoolbook" w:hAnsi="Century Schoolbook"/>
+        </w:rPr>
+      </w:pPr>
+    </w:p>
+    <w:p>
+      <w:pPr>
+        <w:jc w:val="both"/>
+        <w:rPr>
+          <w:rFonts w:ascii="Century Schoolbook" w:hAnsi="Century Schoolbook"/>
+        </w:rPr>
+      </w:pPr>
+    </w:p>
+    <w:p>
+      <w:pPr>
+        <w:jc w:val="both"/>
+        <w:rPr>
+          <w:rFonts w:ascii="Century Schoolbook" w:hAnsi="Century Schoolbook"/>
+        </w:rPr>
+      </w:pPr>
+    </w:p>
+    <w:p>
+      <w:pPr>
+        <w:jc w:val="both"/>
+        <w:rPr>
+          <w:rFonts w:ascii="Century Schoolbook" w:hAnsi="Century Schoolbook"/>
+        </w:rPr>
+      </w:pPr>
+    </w:p>
+    <w:p>
+      <w:pPr>
+        <w:jc w:val="both"/>
+        <w:rPr>
+          <w:rFonts w:ascii="Century Schoolbook" w:hAnsi="Century Schoolbook" w:hint="eastAsia"/>
         </w:rPr>
       </w:pPr>
     </w:p>
@@ -3304,7 +3490,6 @@
         </w:rPr>
         <w:t xml:space="preserve">Run the correlation filter against the binary indicator for the </w:t>
       </w:r>
-      <w:proofErr w:type="spellStart"/>
       <w:proofErr w:type="gramStart"/>
       <w:r>
         <w:rPr>
@@ -3314,7 +3499,6 @@
         </w:rPr>
         <w:t>comp.graphics</w:t>
       </w:r>
-      <w:proofErr w:type="spellEnd"/>
       <w:proofErr w:type="gramEnd"/>
       <w:r>
         <w:rPr>
@@ -3322,7 +3506,6 @@
         </w:rPr>
         <w:t xml:space="preserve"> class. Inspect the top 10 features sorted by </w:t>
       </w:r>
-      <w:proofErr w:type="spellStart"/>
       <w:r>
         <w:rPr>
           <w:rFonts w:ascii="Century Schoolbook" w:hAnsi="Century Schoolbook"/>
@@ -3331,14 +3514,12 @@
         </w:rPr>
         <w:t>pearson_r</w:t>
       </w:r>
-      <w:proofErr w:type="spellEnd"/>
       <w:r>
         <w:rPr>
           <w:rFonts w:ascii="Century Schoolbook" w:hAnsi="Century Schoolbook"/>
         </w:rPr>
         <w:t xml:space="preserve"> and compare them to the top 10 features sorted by </w:t>
       </w:r>
-      <w:proofErr w:type="spellStart"/>
       <w:r>
         <w:rPr>
           <w:rFonts w:ascii="Century Schoolbook" w:hAnsi="Century Schoolbook"/>
@@ -3347,7 +3528,6 @@
         </w:rPr>
         <w:t>spearman_r</w:t>
       </w:r>
-      <w:proofErr w:type="spellEnd"/>
       <w:r>
         <w:rPr>
           <w:rFonts w:ascii="Century Schoolbook" w:hAnsi="Century Schoolbook"/>
@@ -3373,7 +3553,7 @@
     </w:p>
     <w:p>
       <w:pPr>
-        <w:pStyle w:val="ListParagraph"/>
+        <w:pStyle w:val="a9"/>
         <w:numPr>
           <w:ilvl w:val="1"/>
           <w:numId w:val="7"/>
@@ -3392,7 +3572,7 @@
     </w:p>
     <w:p>
       <w:pPr>
-        <w:pStyle w:val="ListParagraph"/>
+        <w:pStyle w:val="a9"/>
         <w:numPr>
           <w:ilvl w:val="1"/>
           <w:numId w:val="7"/>
@@ -3439,7 +3619,7 @@
     </w:p>
     <w:p>
       <w:pPr>
-        <w:pStyle w:val="ListParagraph"/>
+        <w:pStyle w:val="a9"/>
         <w:numPr>
           <w:ilvl w:val="1"/>
           <w:numId w:val="7"/>
@@ -3489,6 +3669,8 @@
         <w:jc w:val="both"/>
         <w:rPr>
           <w:rFonts w:ascii="Century Schoolbook" w:hAnsi="Century Schoolbook"/>
+          <w:b/>
+          <w:bCs/>
         </w:rPr>
       </w:pPr>
       <w:r>
@@ -3499,6 +3681,342 @@
         </w:rPr>
         <w:t>Answer:</w:t>
       </w:r>
+      <w:r>
+        <w:rPr>
+          <w:rFonts w:ascii="Century Schoolbook" w:hAnsi="Century Schoolbook" w:hint="eastAsia"/>
+          <w:b/>
+          <w:bCs/>
+        </w:rPr>
+        <w:t xml:space="preserve">1. </w:t>
+      </w:r>
+      <w:r>
+        <w:rPr>
+          <w:rFonts w:ascii="Century Schoolbook" w:hAnsi="Century Schoolbook"/>
+          <w:b/>
+          <w:bCs/>
+        </w:rPr>
+        <w:t>domain-specific terminology for graphics</w:t>
+      </w:r>
+      <w:r>
+        <w:rPr>
+          <w:rFonts w:ascii="Century Schoolbook" w:hAnsi="Century Schoolbook" w:hint="eastAsia"/>
+          <w:b/>
+          <w:bCs/>
+        </w:rPr>
+        <w:t xml:space="preserve"> </w:t>
+      </w:r>
+    </w:p>
+    <w:p>
+      <w:pPr>
+        <w:ind w:firstLineChars="400" w:firstLine="881"/>
+        <w:jc w:val="both"/>
+        <w:rPr>
+          <w:rFonts w:ascii="Century Schoolbook" w:hAnsi="Century Schoolbook"/>
+          <w:b/>
+          <w:bCs/>
+        </w:rPr>
+      </w:pPr>
+      <w:r>
+        <w:rPr>
+          <w:rFonts w:ascii="Century Schoolbook" w:hAnsi="Century Schoolbook" w:hint="eastAsia"/>
+          <w:b/>
+          <w:bCs/>
+        </w:rPr>
+        <w:t>2.</w:t>
+      </w:r>
+      <w:r>
+        <w:rPr>
+          <w:rFonts w:ascii="Century Schoolbook" w:hAnsi="Century Schoolbook" w:hint="eastAsia"/>
+          <w:b/>
+          <w:bCs/>
+        </w:rPr>
+        <w:t xml:space="preserve"> </w:t>
+      </w:r>
+    </w:p>
+    <w:tbl>
+      <w:tblPr>
+        <w:tblStyle w:val="af5"/>
+        <w:tblW w:w="8505" w:type="dxa"/>
+        <w:tblInd w:w="1413" w:type="dxa"/>
+        <w:tblLook w:val="04A0" w:firstRow="1" w:lastRow="0" w:firstColumn="1" w:lastColumn="0" w:noHBand="0" w:noVBand="1"/>
+      </w:tblPr>
+      <w:tblGrid>
+        <w:gridCol w:w="3827"/>
+        <w:gridCol w:w="4678"/>
+      </w:tblGrid>
+      <w:tr>
+        <w:tc>
+          <w:tcPr>
+            <w:tcW w:w="3827" w:type="dxa"/>
+          </w:tcPr>
+          <w:p>
+            <w:pPr>
+              <w:jc w:val="both"/>
+              <w:rPr>
+                <w:rFonts w:ascii="Century Schoolbook" w:hAnsi="Century Schoolbook"/>
+                <w:b/>
+                <w:bCs/>
+              </w:rPr>
+            </w:pPr>
+            <w:r>
+              <w:rPr>
+                <w:rFonts w:ascii="Century Schoolbook" w:hAnsi="Century Schoolbook"/>
+                <w:b/>
+                <w:bCs/>
+              </w:rPr>
+              <w:t>Pearson Correlation</w:t>
+            </w:r>
+          </w:p>
+        </w:tc>
+        <w:tc>
+          <w:tcPr>
+            <w:tcW w:w="4678" w:type="dxa"/>
+          </w:tcPr>
+          <w:p>
+            <w:pPr>
+              <w:jc w:val="both"/>
+              <w:rPr>
+                <w:rFonts w:ascii="Century Schoolbook" w:hAnsi="Century Schoolbook"/>
+                <w:b/>
+                <w:bCs/>
+              </w:rPr>
+            </w:pPr>
+            <w:r>
+              <w:rPr>
+                <w:rFonts w:ascii="Century Schoolbook" w:hAnsi="Century Schoolbook"/>
+                <w:b/>
+                <w:bCs/>
+              </w:rPr>
+              <w:t>Spearman Correlation</w:t>
+            </w:r>
+          </w:p>
+        </w:tc>
+      </w:tr>
+      <w:tr>
+        <w:tc>
+          <w:tcPr>
+            <w:tcW w:w="3827" w:type="dxa"/>
+          </w:tcPr>
+          <w:p>
+            <w:pPr>
+              <w:jc w:val="both"/>
+              <w:rPr>
+                <w:rFonts w:ascii="Century Schoolbook" w:hAnsi="Century Schoolbook"/>
+                <w:b/>
+                <w:bCs/>
+              </w:rPr>
+            </w:pPr>
+            <w:r>
+              <w:rPr>
+                <w:rFonts w:ascii="Century Schoolbook" w:hAnsi="Century Schoolbook"/>
+                <w:b/>
+                <w:bCs/>
+              </w:rPr>
+              <w:t>Measures linear relationships</w:t>
+            </w:r>
+          </w:p>
+        </w:tc>
+        <w:tc>
+          <w:tcPr>
+            <w:tcW w:w="4678" w:type="dxa"/>
+          </w:tcPr>
+          <w:p>
+            <w:pPr>
+              <w:jc w:val="both"/>
+              <w:rPr>
+                <w:rFonts w:ascii="Century Schoolbook" w:hAnsi="Century Schoolbook"/>
+                <w:b/>
+                <w:bCs/>
+              </w:rPr>
+            </w:pPr>
+            <w:r>
+              <w:rPr>
+                <w:rFonts w:ascii="Century Schoolbook" w:hAnsi="Century Schoolbook"/>
+                <w:b/>
+                <w:bCs/>
+              </w:rPr>
+              <w:t>Measures monotonic relationships</w:t>
+            </w:r>
+          </w:p>
+        </w:tc>
+      </w:tr>
+      <w:tr>
+        <w:tc>
+          <w:tcPr>
+            <w:tcW w:w="3827" w:type="dxa"/>
+          </w:tcPr>
+          <w:p>
+            <w:pPr>
+              <w:jc w:val="both"/>
+              <w:rPr>
+                <w:rFonts w:ascii="Century Schoolbook" w:hAnsi="Century Schoolbook"/>
+                <w:b/>
+                <w:bCs/>
+              </w:rPr>
+            </w:pPr>
+            <w:r>
+              <w:rPr>
+                <w:rFonts w:ascii="Century Schoolbook" w:hAnsi="Century Schoolbook"/>
+                <w:b/>
+                <w:bCs/>
+              </w:rPr>
+              <w:t>Uses original numerical values</w:t>
+            </w:r>
+          </w:p>
+        </w:tc>
+        <w:tc>
+          <w:tcPr>
+            <w:tcW w:w="4678" w:type="dxa"/>
+          </w:tcPr>
+          <w:p>
+            <w:pPr>
+              <w:jc w:val="both"/>
+              <w:rPr>
+                <w:rFonts w:ascii="Century Schoolbook" w:hAnsi="Century Schoolbook"/>
+                <w:b/>
+                <w:bCs/>
+              </w:rPr>
+            </w:pPr>
+            <w:r>
+              <w:rPr>
+                <w:rFonts w:ascii="Century Schoolbook" w:hAnsi="Century Schoolbook"/>
+                <w:b/>
+                <w:bCs/>
+              </w:rPr>
+              <w:t>Uses ranked values</w:t>
+            </w:r>
+          </w:p>
+        </w:tc>
+      </w:tr>
+      <w:tr>
+        <w:tc>
+          <w:tcPr>
+            <w:tcW w:w="3827" w:type="dxa"/>
+          </w:tcPr>
+          <w:p>
+            <w:pPr>
+              <w:jc w:val="both"/>
+              <w:rPr>
+                <w:rFonts w:ascii="Century Schoolbook" w:hAnsi="Century Schoolbook"/>
+                <w:b/>
+                <w:bCs/>
+              </w:rPr>
+            </w:pPr>
+            <w:r>
+              <w:rPr>
+                <w:rFonts w:ascii="Century Schoolbook" w:hAnsi="Century Schoolbook"/>
+                <w:b/>
+                <w:bCs/>
+              </w:rPr>
+              <w:t>Sensitive to extreme values</w:t>
+            </w:r>
+          </w:p>
+        </w:tc>
+        <w:tc>
+          <w:tcPr>
+            <w:tcW w:w="4678" w:type="dxa"/>
+          </w:tcPr>
+          <w:p>
+            <w:pPr>
+              <w:jc w:val="both"/>
+              <w:rPr>
+                <w:rFonts w:ascii="Century Schoolbook" w:hAnsi="Century Schoolbook"/>
+                <w:b/>
+                <w:bCs/>
+              </w:rPr>
+            </w:pPr>
+            <w:r>
+              <w:rPr>
+                <w:rFonts w:ascii="Century Schoolbook" w:hAnsi="Century Schoolbook"/>
+                <w:b/>
+                <w:bCs/>
+              </w:rPr>
+              <w:t>Less sensitive to extreme values</w:t>
+            </w:r>
+          </w:p>
+        </w:tc>
+      </w:tr>
+    </w:tbl>
+    <w:p>
+      <w:pPr>
+        <w:ind w:firstLineChars="400" w:firstLine="881"/>
+        <w:jc w:val="both"/>
+        <w:rPr>
+          <w:rFonts w:ascii="Century Schoolbook" w:hAnsi="Century Schoolbook" w:hint="eastAsia"/>
+          <w:b/>
+          <w:bCs/>
+        </w:rPr>
+      </w:pPr>
+      <w:r>
+        <w:rPr>
+          <w:rFonts w:ascii="Century Schoolbook" w:hAnsi="Century Schoolbook" w:hint="eastAsia"/>
+          <w:b/>
+          <w:bCs/>
+        </w:rPr>
+        <w:t>3</w:t>
+      </w:r>
+      <w:proofErr w:type="gramStart"/>
+      <w:r>
+        <w:rPr>
+          <w:rFonts w:ascii="Century Schoolbook" w:hAnsi="Century Schoolbook" w:hint="eastAsia"/>
+          <w:b/>
+          <w:bCs/>
+        </w:rPr>
+        <w:t>.</w:t>
+      </w:r>
+      <w:r>
+        <w:t xml:space="preserve"> </w:t>
+      </w:r>
+      <w:r>
+        <w:rPr>
+          <w:rFonts w:hint="eastAsia"/>
+        </w:rPr>
+        <w:t xml:space="preserve"> </w:t>
+      </w:r>
+      <w:r>
+        <w:rPr>
+          <w:rFonts w:ascii="Century Schoolbook" w:hAnsi="Century Schoolbook"/>
+          <w:b/>
+          <w:bCs/>
+        </w:rPr>
+        <w:t>A</w:t>
+      </w:r>
+      <w:proofErr w:type="gramEnd"/>
+      <w:r>
+        <w:rPr>
+          <w:rFonts w:ascii="Century Schoolbook" w:hAnsi="Century Schoolbook"/>
+          <w:b/>
+          <w:bCs/>
+        </w:rPr>
+        <w:t xml:space="preserve"> term's frequency in </w:t>
+      </w:r>
+      <w:proofErr w:type="gramStart"/>
+      <w:r>
+        <w:rPr>
+          <w:rFonts w:ascii="Century Schoolbook" w:hAnsi="Century Schoolbook"/>
+          <w:b/>
+          <w:bCs/>
+        </w:rPr>
+        <w:t>comp.graphics</w:t>
+      </w:r>
+      <w:proofErr w:type="gramEnd"/>
+      <w:r>
+        <w:rPr>
+          <w:rFonts w:ascii="Century Schoolbook" w:hAnsi="Century Schoolbook"/>
+          <w:b/>
+          <w:bCs/>
+        </w:rPr>
+        <w:t xml:space="preserve"> articles has a stable ranking with its category. However, outliers can heavily distort Pearson correlation, whereas Spearman correlation remains robust against extreme values because it relies on ranks rather than raw numbers.</w:t>
+      </w:r>
+    </w:p>
+    <w:p>
+      <w:pPr>
+        <w:ind w:firstLineChars="400" w:firstLine="880"/>
+        <w:jc w:val="both"/>
+        <w:rPr>
+          <w:rFonts w:ascii="Century Schoolbook" w:hAnsi="Century Schoolbook" w:hint="eastAsia"/>
+        </w:rPr>
+      </w:pPr>
     </w:p>
     <w:p>
       <w:pPr>
@@ -3519,7 +4037,7 @@
         <w:rPr>
           <w:rFonts w:ascii="Century Schoolbook" w:hAnsi="Century Schoolbook"/>
         </w:rPr>
-        <w:t xml:space="preserve"> Yes / No </w:t>
+        <w:t xml:space="preserve"> No </w:t>
       </w:r>
     </w:p>
     <w:p>
@@ -3695,7 +4213,6 @@
         </w:rPr>
         <w:t xml:space="preserve">. Then, run </w:t>
       </w:r>
-      <w:proofErr w:type="spellStart"/>
       <w:r>
         <w:rPr>
           <w:rFonts w:ascii="Century Schoolbook" w:hAnsi="Century Schoolbook"/>
@@ -3704,48 +4221,19 @@
         </w:rPr>
         <w:t>MaxFPGrowth</w:t>
       </w:r>
-      <w:proofErr w:type="spellEnd"/>
       <w:r>
         <w:rPr>
           <w:rFonts w:ascii="Century Schoolbook" w:hAnsi="Century Schoolbook"/>
         </w:rPr>
         <w:t xml:space="preserve"> using minimum support thresholds </w:t>
       </w:r>
-      <w:proofErr w:type="spellStart"/>
-      <w:r>
-        <w:rPr>
-          <w:rFonts w:ascii="Century Schoolbook" w:hAnsi="Century Schoolbook"/>
-          <w:b/>
-          <w:bCs/>
-        </w:rPr>
-        <w:t>minSup</w:t>
-      </w:r>
-      <w:proofErr w:type="spellEnd"/>
-      <w:r>
-        <w:rPr>
-          <w:rFonts w:ascii="Century Schoolbook" w:hAnsi="Century Schoolbook"/>
-          <w:b/>
-          <w:bCs/>
-        </w:rPr>
-        <w:t xml:space="preserve">=9 and </w:t>
-      </w:r>
-      <w:proofErr w:type="spellStart"/>
-      <w:r>
-        <w:rPr>
-          <w:rFonts w:ascii="Century Schoolbook" w:hAnsi="Century Schoolbook"/>
-          <w:b/>
-          <w:bCs/>
-        </w:rPr>
-        <w:t>minSup</w:t>
-      </w:r>
-      <w:proofErr w:type="spellEnd"/>
-      <w:r>
-        <w:rPr>
-          <w:rFonts w:ascii="Century Schoolbook" w:hAnsi="Century Schoolbook"/>
-          <w:b/>
-          <w:bCs/>
-        </w:rPr>
-        <w:t>= 3</w:t>
+      <w:r>
+        <w:rPr>
+          <w:rFonts w:ascii="Century Schoolbook" w:hAnsi="Century Schoolbook"/>
+          <w:b/>
+          <w:bCs/>
+        </w:rPr>
+        <w:t>minSup=9 and minSup= 3</w:t>
       </w:r>
       <w:r>
         <w:rPr>
@@ -3790,7 +4278,6 @@
         </w:rPr>
         <w:t xml:space="preserve">How does decreasing </w:t>
       </w:r>
-      <w:proofErr w:type="spellStart"/>
       <w:r>
         <w:rPr>
           <w:rFonts w:ascii="Century Schoolbook" w:hAnsi="Century Schoolbook"/>
@@ -3799,14 +4286,12 @@
         </w:rPr>
         <w:t>minSup</w:t>
       </w:r>
-      <w:proofErr w:type="spellEnd"/>
       <w:r>
         <w:rPr>
           <w:rFonts w:ascii="Century Schoolbook" w:hAnsi="Century Schoolbook"/>
         </w:rPr>
         <w:t xml:space="preserve"> (from 9 to 3) in </w:t>
       </w:r>
-      <w:proofErr w:type="spellStart"/>
       <w:r>
         <w:rPr>
           <w:rFonts w:ascii="Century Schoolbook" w:hAnsi="Century Schoolbook"/>
@@ -3815,7 +4300,6 @@
         </w:rPr>
         <w:t>MaxFPGrowth</w:t>
       </w:r>
-      <w:proofErr w:type="spellEnd"/>
       <w:r>
         <w:rPr>
           <w:rFonts w:ascii="Century Schoolbook" w:hAnsi="Century Schoolbook"/>
@@ -3865,7 +4349,6 @@
         </w:rPr>
         <w:t xml:space="preserve"> differ fundamentally from </w:t>
       </w:r>
-      <w:proofErr w:type="spellStart"/>
       <w:r>
         <w:rPr>
           <w:rFonts w:ascii="Century Schoolbook" w:hAnsi="Century Schoolbook"/>
@@ -3874,14 +4357,12 @@
         </w:rPr>
         <w:t>minSup</w:t>
       </w:r>
-      <w:proofErr w:type="spellEnd"/>
       <w:r>
         <w:rPr>
           <w:rFonts w:ascii="Century Schoolbook" w:hAnsi="Century Schoolbook"/>
         </w:rPr>
         <w:t xml:space="preserve"> in </w:t>
       </w:r>
-      <w:proofErr w:type="spellStart"/>
       <w:r>
         <w:rPr>
           <w:rFonts w:ascii="Century Schoolbook" w:hAnsi="Century Schoolbook"/>
@@ -3890,7 +4371,6 @@
         </w:rPr>
         <w:t>MaxFPGrowth</w:t>
       </w:r>
-      <w:proofErr w:type="spellEnd"/>
       <w:r>
         <w:rPr>
           <w:rFonts w:ascii="Century Schoolbook" w:hAnsi="Century Schoolbook"/>
@@ -3914,6 +4394,7 @@
         <w:rPr>
           <w:rFonts w:ascii="Century Schoolbook" w:hAnsi="Century Schoolbook"/>
         </w:rPr>
+        <w:lastRenderedPageBreak/>
         <w:t>Why are "maximal" frequent patterns structurally more concise than standard frequent patterns?</w:t>
       </w:r>
     </w:p>
@@ -3922,6 +4403,8 @@
         <w:jc w:val="both"/>
         <w:rPr>
           <w:rFonts w:ascii="Century Schoolbook" w:hAnsi="Century Schoolbook"/>
+          <w:b/>
+          <w:bCs/>
         </w:rPr>
       </w:pPr>
       <w:r>
@@ -3948,32 +4431,72 @@
           <w:b/>
           <w:bCs/>
         </w:rPr>
-        <w:t xml:space="preserve"> Runtime and pattern count when lowering </w:t>
-      </w:r>
-      <w:proofErr w:type="spellStart"/>
-      <w:r>
-        <w:rPr>
-          <w:rFonts w:ascii="Century Schoolbook" w:hAnsi="Century Schoolbook"/>
-          <w:b/>
-          <w:bCs/>
-        </w:rPr>
-        <w:t>minSup</w:t>
-      </w:r>
-      <w:proofErr w:type="spellEnd"/>
-      <w:r>
-        <w:rPr>
-          <w:rFonts w:ascii="Century Schoolbook" w:hAnsi="Century Schoolbook"/>
-          <w:b/>
-          <w:bCs/>
-        </w:rPr>
-        <w:t>:</w:t>
-      </w:r>
-    </w:p>
-    <w:p>
-      <w:pPr>
-        <w:jc w:val="both"/>
-        <w:rPr>
-          <w:rFonts w:ascii="Century Schoolbook" w:hAnsi="Century Schoolbook"/>
+        <w:t xml:space="preserve"> Runtime and pattern count when lowering minSup:</w:t>
+      </w:r>
+    </w:p>
+    <w:p>
+      <w:pPr>
+        <w:jc w:val="both"/>
+        <w:rPr>
+          <w:rFonts w:ascii="Century Schoolbook" w:hAnsi="Century Schoolbook"/>
+        </w:rPr>
+      </w:pPr>
+      <w:r>
+        <w:rPr>
+          <w:rFonts w:ascii="Century Schoolbook" w:hAnsi="Century Schoolbook"/>
+        </w:rPr>
+        <w:t xml:space="preserve">When minSup decreased from 9 to 3, the number of </w:t>
+      </w:r>
+      <w:proofErr w:type="gramStart"/>
+      <w:r>
+        <w:rPr>
+          <w:rFonts w:ascii="Century Schoolbook" w:hAnsi="Century Schoolbook"/>
+        </w:rPr>
+        <w:t>discovered maximal frequent patterns</w:t>
+      </w:r>
+      <w:proofErr w:type="gramEnd"/>
+      <w:r>
+        <w:rPr>
+          <w:rFonts w:ascii="Century Schoolbook" w:hAnsi="Century Schoolbook"/>
+        </w:rPr>
+        <w:t xml:space="preserve"> increased from 710 to 9,547, while the execution runtime increased from 0.0856 to 1.7702 seconds. This happened because a lower minimum support threshold allows more </w:t>
+      </w:r>
+      <w:proofErr w:type="gramStart"/>
+      <w:r>
+        <w:rPr>
+          <w:rFonts w:ascii="Century Schoolbook" w:hAnsi="Century Schoolbook"/>
+        </w:rPr>
+        <w:t>low-frequency</w:t>
+      </w:r>
+      <w:proofErr w:type="gramEnd"/>
+      <w:r>
+        <w:rPr>
+          <w:rFonts w:ascii="Century Schoolbook" w:hAnsi="Century Schoolbook"/>
+        </w:rPr>
+        <w:t xml:space="preserve"> itemsets to qualify as </w:t>
+      </w:r>
+      <w:proofErr w:type="gramStart"/>
+      <w:r>
+        <w:rPr>
+          <w:rFonts w:ascii="Century Schoolbook" w:hAnsi="Century Schoolbook"/>
+        </w:rPr>
+        <w:t>frequent</w:t>
+      </w:r>
+      <w:proofErr w:type="gramEnd"/>
+      <w:r>
+        <w:rPr>
+          <w:rFonts w:ascii="Century Schoolbook" w:hAnsi="Century Schoolbook"/>
+        </w:rPr>
+        <w:t>, expanding the search space and increasing computational cost.</w:t>
+      </w:r>
+    </w:p>
+    <w:p>
+      <w:pPr>
+        <w:jc w:val="both"/>
+        <w:rPr>
+          <w:rFonts w:ascii="Century Schoolbook" w:hAnsi="Century Schoolbook"/>
+          <w:b/>
+          <w:bCs/>
         </w:rPr>
       </w:pPr>
       <w:r>
@@ -4000,115 +4523,179 @@
           <w:b/>
           <w:bCs/>
         </w:rPr>
-        <w:t xml:space="preserve"> Top-K k vs </w:t>
-      </w:r>
-      <w:proofErr w:type="spellStart"/>
-      <w:r>
-        <w:rPr>
-          <w:rFonts w:ascii="Century Schoolbook" w:hAnsi="Century Schoolbook"/>
-          <w:b/>
-          <w:bCs/>
-        </w:rPr>
-        <w:t>MaxFPGrowth</w:t>
-      </w:r>
-      <w:proofErr w:type="spellEnd"/>
-      <w:r>
-        <w:rPr>
-          <w:rFonts w:ascii="Century Schoolbook" w:hAnsi="Century Schoolbook"/>
-          <w:b/>
-          <w:bCs/>
+        <w:t xml:space="preserve"> Top-K k vs MaxFPGrowth minSup:</w:t>
+      </w:r>
+    </w:p>
+    <w:p>
+      <w:pPr>
+        <w:jc w:val="both"/>
+        <w:rPr>
+          <w:rFonts w:ascii="Century Schoolbook" w:hAnsi="Century Schoolbook"/>
+        </w:rPr>
+      </w:pPr>
+      <w:r>
+        <w:rPr>
+          <w:rFonts w:ascii="Century Schoolbook" w:hAnsi="Century Schoolbook"/>
+        </w:rPr>
+        <w:t xml:space="preserve">The parameter k in </w:t>
+      </w:r>
+      <w:proofErr w:type="gramStart"/>
+      <w:r>
+        <w:rPr>
+          <w:rFonts w:ascii="Century Schoolbook" w:hAnsi="Century Schoolbook"/>
+        </w:rPr>
+        <w:t>Top-K</w:t>
+      </w:r>
+      <w:proofErr w:type="gramEnd"/>
+      <w:r>
+        <w:rPr>
+          <w:rFonts w:ascii="Century Schoolbook" w:hAnsi="Century Schoolbook"/>
+        </w:rPr>
+        <w:t xml:space="preserve"> FAE specifies the number of highest-ranked frequent patterns to discover. In contrast, minSup in MaxFPGrowth specifies the minimum occurrence frequency required for a pattern to be considered frequent. Therefore, k controls the number of selected patterns, while minSup controls the frequency threshold. MaxFPGrowth additionally retains only maximal frequent patterns.</w:t>
+      </w:r>
+    </w:p>
+    <w:p>
+      <w:pPr>
+        <w:jc w:val="both"/>
+        <w:rPr>
+          <w:rFonts w:ascii="Century Schoolbook" w:hAnsi="Century Schoolbook"/>
+          <w:b/>
+          <w:bCs/>
+        </w:rPr>
+      </w:pPr>
+      <w:r>
+        <w:rPr>
+          <w:rFonts w:ascii="Century Schoolbook" w:hAnsi="Century Schoolbook"/>
+          <w:b/>
+          <w:bCs/>
+        </w:rPr>
+        <w:t>Answer (</w:t>
+      </w:r>
+      <w:proofErr w:type="gramStart"/>
+      <w:r>
+        <w:rPr>
+          <w:rFonts w:ascii="Century Schoolbook" w:hAnsi="Century Schoolbook"/>
+          <w:b/>
+          <w:bCs/>
+        </w:rPr>
+        <w:t>3) —</w:t>
+      </w:r>
+      <w:proofErr w:type="gramEnd"/>
+      <w:r>
+        <w:rPr>
+          <w:rFonts w:ascii="Century Schoolbook" w:hAnsi="Century Schoolbook"/>
+          <w:b/>
+          <w:bCs/>
+        </w:rPr>
+        <w:t xml:space="preserve"> Maximal vs standard frequent patterns:</w:t>
+      </w:r>
+    </w:p>
+    <w:p>
+      <w:pPr>
+        <w:jc w:val="both"/>
+        <w:rPr>
+          <w:rFonts w:ascii="Century Schoolbook" w:hAnsi="Century Schoolbook"/>
+        </w:rPr>
+      </w:pPr>
+      <w:r>
+        <w:rPr>
+          <w:rFonts w:ascii="Century Schoolbook" w:hAnsi="Century Schoolbook"/>
+        </w:rPr>
+        <w:t xml:space="preserve">Maximal frequent patterns are more concise because they only keep frequent itemsets that are not subsets of any larger frequent itemset. For example, if is a maximal frequent pattern, its subsets such </w:t>
+      </w:r>
+      <w:proofErr w:type="gramStart"/>
+      <w:r>
+        <w:rPr>
+          <w:rFonts w:ascii="Century Schoolbook" w:hAnsi="Century Schoolbook"/>
+        </w:rPr>
+        <w:t>as ,</w:t>
+      </w:r>
+      <w:proofErr w:type="gramEnd"/>
+      <w:r>
+        <w:rPr>
+          <w:rFonts w:ascii="Century Schoolbook" w:hAnsi="Century Schoolbook"/>
+        </w:rPr>
+        <w:t xml:space="preserve"> , and do not need to be listed separately. This reduces redundancy and the total number of reported patterns. However, the exact support values of the omitted subsets are not preserved.</w:t>
+      </w:r>
+    </w:p>
+    <w:p>
+      <w:pPr>
+        <w:jc w:val="both"/>
+        <w:rPr>
+          <w:rFonts w:ascii="Century Schoolbook" w:hAnsi="Century Schoolbook"/>
+        </w:rPr>
+      </w:pPr>
+      <w:r>
+        <w:rPr>
+          <w:rFonts w:ascii="Century Schoolbook" w:hAnsi="Century Schoolbook"/>
+          <w:b/>
+          <w:bCs/>
+        </w:rPr>
+        <w:t>AI used for this answer:</w:t>
+      </w:r>
+      <w:r>
+        <w:rPr>
+          <w:rFonts w:ascii="Century Schoolbook" w:hAnsi="Century Schoolbook"/>
+        </w:rPr>
+        <w:t xml:space="preserve"> Yes </w:t>
+      </w:r>
+    </w:p>
+    <w:p>
+      <w:pPr>
+        <w:jc w:val="both"/>
+        <w:rPr>
+          <w:rFonts w:ascii="Century Schoolbook" w:hAnsi="Century Schoolbook" w:hint="eastAsia"/>
+        </w:rPr>
+      </w:pPr>
+      <w:r>
+        <w:rPr>
+          <w:rFonts w:ascii="Century Schoolbook" w:hAnsi="Century Schoolbook"/>
+          <w:b/>
+          <w:bCs/>
+        </w:rPr>
+        <w:t>If yes, how:</w:t>
+      </w:r>
+      <w:r>
+        <w:rPr>
+          <w:rFonts w:ascii="Century Schoolbook" w:hAnsi="Century Schoolbook"/>
         </w:rPr>
         <w:t xml:space="preserve"> </w:t>
       </w:r>
-      <w:proofErr w:type="spellStart"/>
-      <w:r>
-        <w:rPr>
-          <w:rFonts w:ascii="Century Schoolbook" w:hAnsi="Century Schoolbook"/>
-          <w:b/>
-          <w:bCs/>
-        </w:rPr>
-        <w:t>minSup</w:t>
-      </w:r>
-      <w:proofErr w:type="spellEnd"/>
-      <w:r>
-        <w:rPr>
-          <w:rFonts w:ascii="Century Schoolbook" w:hAnsi="Century Schoolbook"/>
-          <w:b/>
-          <w:bCs/>
-        </w:rPr>
-        <w:t>:</w:t>
-      </w:r>
-    </w:p>
-    <w:p>
-      <w:pPr>
-        <w:jc w:val="both"/>
-        <w:rPr>
-          <w:rFonts w:ascii="Century Schoolbook" w:hAnsi="Century Schoolbook"/>
-        </w:rPr>
-      </w:pPr>
-      <w:r>
-        <w:rPr>
-          <w:rFonts w:ascii="Century Schoolbook" w:hAnsi="Century Schoolbook"/>
-          <w:b/>
-          <w:bCs/>
-        </w:rPr>
-        <w:t>Answer (</w:t>
+      <w:r>
+        <w:rPr>
+          <w:rFonts w:ascii="Century Schoolbook" w:hAnsi="Century Schoolbook"/>
+        </w:rPr>
+        <w:t xml:space="preserve">I used ChatGPT to help debug Python errors, understand the differences between </w:t>
       </w:r>
       <w:proofErr w:type="gramStart"/>
       <w:r>
         <w:rPr>
           <w:rFonts w:ascii="Century Schoolbook" w:hAnsi="Century Schoolbook"/>
-          <w:b/>
-          <w:bCs/>
-        </w:rPr>
-        <w:t>3) —</w:t>
+        </w:rPr>
+        <w:t>Top-K</w:t>
       </w:r>
       <w:proofErr w:type="gramEnd"/>
       <w:r>
         <w:rPr>
           <w:rFonts w:ascii="Century Schoolbook" w:hAnsi="Century Schoolbook"/>
-          <w:b/>
-          <w:bCs/>
-        </w:rPr>
-        <w:t xml:space="preserve"> Maximal vs standard frequent patterns:</w:t>
-      </w:r>
-    </w:p>
-    <w:p>
-      <w:pPr>
-        <w:jc w:val="both"/>
-        <w:rPr>
-          <w:rFonts w:ascii="Century Schoolbook" w:hAnsi="Century Schoolbook"/>
-        </w:rPr>
-      </w:pPr>
-      <w:r>
-        <w:rPr>
-          <w:rFonts w:ascii="Century Schoolbook" w:hAnsi="Century Schoolbook"/>
-          <w:b/>
-          <w:bCs/>
-        </w:rPr>
-        <w:t>AI used for this answer:</w:t>
-      </w:r>
-      <w:r>
-        <w:rPr>
-          <w:rFonts w:ascii="Century Schoolbook" w:hAnsi="Century Schoolbook"/>
-        </w:rPr>
-        <w:t xml:space="preserve"> Yes / No </w:t>
-      </w:r>
-    </w:p>
-    <w:p>
-      <w:pPr>
-        <w:jc w:val="both"/>
-        <w:rPr>
-          <w:rFonts w:ascii="Century Schoolbook" w:hAnsi="Century Schoolbook"/>
-        </w:rPr>
-      </w:pPr>
-      <w:r>
-        <w:rPr>
-          <w:rFonts w:ascii="Century Schoolbook" w:hAnsi="Century Schoolbook"/>
-          <w:b/>
-          <w:bCs/>
-        </w:rPr>
-        <w:t>If yes, how:</w:t>
+        </w:rPr>
+        <w:t xml:space="preserve"> FAE and MaxFPGrowth, interpret the experimental results, and improve the clarity and grammar of my English explanations. I ran the experiments myself in Jupyter Notebook and collected the results.</w:t>
+      </w:r>
+    </w:p>
+    <w:p>
+      <w:pPr>
+        <w:jc w:val="both"/>
+        <w:rPr>
+          <w:rFonts w:ascii="Century Schoolbook" w:hAnsi="Century Schoolbook" w:hint="eastAsia"/>
+        </w:rPr>
+      </w:pPr>
+      <w:r>
+        <w:rPr>
+          <w:rFonts w:ascii="Century Schoolbook" w:hAnsi="Century Schoolbook"/>
+          <w:b/>
+          <w:bCs/>
+        </w:rPr>
+        <w:t>External references (links):</w:t>
       </w:r>
       <w:r>
         <w:rPr>
@@ -4116,28 +4703,15 @@
         </w:rPr>
         <w:t xml:space="preserve"> </w:t>
       </w:r>
-    </w:p>
-    <w:p>
-      <w:pPr>
-        <w:jc w:val="both"/>
-        <w:rPr>
-          <w:rFonts w:ascii="Century Schoolbook" w:hAnsi="Century Schoolbook"/>
-        </w:rPr>
-      </w:pPr>
-      <w:r>
-        <w:rPr>
-          <w:rFonts w:ascii="Century Schoolbook" w:hAnsi="Century Schoolbook"/>
-          <w:b/>
-          <w:bCs/>
-        </w:rPr>
-        <w:t>External references (links):</w:t>
-      </w:r>
-      <w:r>
-        <w:rPr>
-          <w:rFonts w:ascii="Century Schoolbook" w:hAnsi="Century Schoolbook"/>
-        </w:rPr>
-        <w:t xml:space="preserve"> </w:t>
-      </w:r>
+      <w:hyperlink r:id="rId10" w:history="1">
+        <w:r>
+          <w:rPr>
+            <w:rStyle w:val="af2"/>
+            <w:rFonts w:ascii="Century Schoolbook" w:hAnsi="Century Schoolbook"/>
+          </w:rPr>
+          <w:t>PAMI — Top-K FAE</w:t>
+        </w:r>
+      </w:hyperlink>
     </w:p>
     <w:p>
       <w:pPr>
@@ -4170,7 +4744,6 @@
           <w:b/>
           <w:bCs/>
         </w:rPr>
-        <w:lastRenderedPageBreak/>
         <w:t>Question 8: Dimensionality Reduction — Motivation</w:t>
       </w:r>
     </w:p>
@@ -4219,7 +4792,6 @@
         </w:rPr>
         <w:t xml:space="preserve">After text vectorization, the </w:t>
       </w:r>
-      <w:proofErr w:type="spellStart"/>
       <w:r>
         <w:rPr>
           <w:rFonts w:ascii="Century Schoolbook" w:hAnsi="Century Schoolbook"/>
@@ -4228,7 +4800,6 @@
         </w:rPr>
         <w:t>X_counts</w:t>
       </w:r>
-      <w:proofErr w:type="spellEnd"/>
       <w:r>
         <w:rPr>
           <w:rFonts w:ascii="Century Schoolbook" w:hAnsi="Century Schoolbook"/>
@@ -4254,7 +4825,7 @@
     </w:p>
     <w:p>
       <w:pPr>
-        <w:pStyle w:val="ListParagraph"/>
+        <w:pStyle w:val="a9"/>
         <w:numPr>
           <w:ilvl w:val="0"/>
           <w:numId w:val="20"/>
@@ -4270,7 +4841,6 @@
         </w:rPr>
         <w:t xml:space="preserve">If we want to visually map how these documents group by category on a scatter plot, why is it mathematically and visually impossible to plot the raw </w:t>
       </w:r>
-      <w:proofErr w:type="spellStart"/>
       <w:r>
         <w:rPr>
           <w:rFonts w:ascii="Century Schoolbook" w:hAnsi="Century Schoolbook"/>
@@ -4279,7 +4849,6 @@
         </w:rPr>
         <w:t>X_counts</w:t>
       </w:r>
-      <w:proofErr w:type="spellEnd"/>
       <w:r>
         <w:rPr>
           <w:rFonts w:ascii="Century Schoolbook" w:hAnsi="Century Schoolbook"/>
@@ -4289,7 +4858,7 @@
     </w:p>
     <w:p>
       <w:pPr>
-        <w:pStyle w:val="ListParagraph"/>
+        <w:pStyle w:val="a9"/>
         <w:numPr>
           <w:ilvl w:val="0"/>
           <w:numId w:val="20"/>
@@ -4311,6 +4880,8 @@
         <w:jc w:val="both"/>
         <w:rPr>
           <w:rFonts w:ascii="Century Schoolbook" w:hAnsi="Century Schoolbook"/>
+          <w:b/>
+          <w:bCs/>
         </w:rPr>
       </w:pPr>
       <w:r>
@@ -4321,6 +4892,59 @@
         </w:rPr>
         <w:t>Answer:</w:t>
       </w:r>
+      <w:r>
+        <w:rPr>
+          <w:rFonts w:ascii="新細明體" w:eastAsia="新細明體" w:hAnsi="新細明體" w:cs="新細明體"/>
+          <w:kern w:val="0"/>
+          <w:sz w:val="24"/>
+          <w:szCs w:val="24"/>
+          <w14:ligatures w14:val="none"/>
+        </w:rPr>
+        <w:t xml:space="preserve"> </w:t>
+      </w:r>
+      <w:r>
+        <w:rPr>
+          <w:rFonts w:ascii="Century Schoolbook" w:hAnsi="Century Schoolbook"/>
+          <w:b/>
+          <w:bCs/>
+        </w:rPr>
+        <w:t xml:space="preserve">The X_counts matrix contains tens of thousands of features, with each feature representing a word. A standard scatter plot can only directly display two or three dimensions, so it cannot visualize all the features simultaneously. </w:t>
+      </w:r>
+      <w:r>
+        <w:rPr>
+          <w:rFonts w:ascii="Century Schoolbook" w:hAnsi="Century Schoolbook"/>
+          <w:b/>
+          <w:bCs/>
+        </w:rPr>
+        <w:lastRenderedPageBreak/>
+        <w:t>Therefore, we need to reduce the high-dimensional text data to two or three dimensions while preserving useful information about the relationships between documents.</w:t>
+      </w:r>
+    </w:p>
+    <w:p>
+      <w:pPr>
+        <w:jc w:val="both"/>
+        <w:rPr>
+          <w:rFonts w:ascii="Century Schoolbook" w:hAnsi="Century Schoolbook"/>
+          <w:b/>
+          <w:bCs/>
+        </w:rPr>
+      </w:pPr>
+      <w:r>
+        <w:rPr>
+          <w:rFonts w:ascii="Century Schoolbook" w:hAnsi="Century Schoolbook"/>
+          <w:b/>
+          <w:bCs/>
+        </w:rPr>
+        <w:t>The required algorithms are dimensionality reduction algorithms, such as PCA (Principal Component Analysis), t-SNE (t-distributed Stochastic Neighbor Embedding), and UMAP (Uniform Manifold Approximation and Projection). These methods help visualize document similarities and potential category clusters in a lower-dimensional space.</w:t>
+      </w:r>
+    </w:p>
+    <w:p>
+      <w:pPr>
+        <w:jc w:val="both"/>
+        <w:rPr>
+          <w:rFonts w:ascii="Century Schoolbook" w:hAnsi="Century Schoolbook"/>
+        </w:rPr>
+      </w:pPr>
     </w:p>
     <w:p>
       <w:pPr>
@@ -4341,14 +4965,14 @@
         <w:rPr>
           <w:rFonts w:ascii="Century Schoolbook" w:hAnsi="Century Schoolbook"/>
         </w:rPr>
-        <w:t xml:space="preserve"> Yes / No </w:t>
-      </w:r>
-    </w:p>
-    <w:p>
-      <w:pPr>
-        <w:jc w:val="both"/>
-        <w:rPr>
-          <w:rFonts w:ascii="Century Schoolbook" w:hAnsi="Century Schoolbook"/>
+        <w:t xml:space="preserve"> Yes </w:t>
+      </w:r>
+    </w:p>
+    <w:p>
+      <w:pPr>
+        <w:jc w:val="both"/>
+        <w:rPr>
+          <w:rFonts w:ascii="Century Schoolbook" w:hAnsi="Century Schoolbook" w:hint="eastAsia"/>
         </w:rPr>
       </w:pPr>
       <w:r>
@@ -4365,21 +4989,27 @@
         </w:rPr>
         <w:t xml:space="preserve"> </w:t>
       </w:r>
-    </w:p>
-    <w:p>
-      <w:pPr>
-        <w:jc w:val="both"/>
-        <w:rPr>
-          <w:rFonts w:ascii="Century Schoolbook" w:hAnsi="Century Schoolbook"/>
-        </w:rPr>
-      </w:pPr>
-      <w:r>
-        <w:rPr>
-          <w:rFonts w:ascii="Century Schoolbook" w:hAnsi="Century Schoolbook"/>
-          <w:b/>
-          <w:bCs/>
-        </w:rPr>
-        <w:t>External references (links):</w:t>
+      <w:r>
+        <w:rPr>
+          <w:rFonts w:ascii="Century Schoolbook" w:hAnsi="Century Schoolbook"/>
+        </w:rPr>
+        <w:t>I used ChatGPT to understand the limitations of visualizing high-dimensional text data, learn about dimensionality reduction algorithms, and improve my English explanation.</w:t>
+      </w:r>
+    </w:p>
+    <w:p>
+      <w:pPr>
+        <w:jc w:val="both"/>
+        <w:rPr>
+          <w:rFonts w:ascii="Century Schoolbook" w:hAnsi="Century Schoolbook"/>
+        </w:rPr>
+      </w:pPr>
+      <w:r>
+        <w:rPr>
+          <w:rFonts w:ascii="Century Schoolbook" w:hAnsi="Century Schoolbook"/>
+          <w:b/>
+          <w:bCs/>
+        </w:rPr>
+        <w:t>Externalreferences (links):</w:t>
       </w:r>
       <w:r>
         <w:rPr>
@@ -4387,6 +5017,23 @@
         </w:rPr>
         <w:t xml:space="preserve"> </w:t>
       </w:r>
+      <w:hyperlink r:id="rId11" w:history="1">
+        <w:r>
+          <w:rPr>
+            <w:rStyle w:val="af2"/>
+            <w:rFonts w:ascii="Century Schoolbook" w:hAnsi="Century Schoolbook"/>
+          </w:rPr>
+          <w:t>https://scikit-learn.org/stable/modules/decomposition.html</w:t>
+        </w:r>
+      </w:hyperlink>
+    </w:p>
+    <w:p>
+      <w:pPr>
+        <w:jc w:val="both"/>
+        <w:rPr>
+          <w:rFonts w:ascii="Century Schoolbook" w:hAnsi="Century Schoolbook"/>
+        </w:rPr>
+      </w:pPr>
     </w:p>
     <w:p>
       <w:pPr>
@@ -4536,7 +5183,7 @@
     </w:p>
     <w:p>
       <w:pPr>
-        <w:pStyle w:val="ListParagraph"/>
+        <w:pStyle w:val="a9"/>
         <w:numPr>
           <w:ilvl w:val="0"/>
           <w:numId w:val="21"/>
@@ -4569,7 +5216,7 @@
     </w:p>
     <w:p>
       <w:pPr>
-        <w:pStyle w:val="ListParagraph"/>
+        <w:pStyle w:val="a9"/>
         <w:numPr>
           <w:ilvl w:val="0"/>
           <w:numId w:val="21"/>
@@ -4630,7 +5277,7 @@
     </w:p>
     <w:p>
       <w:pPr>
-        <w:pStyle w:val="ListParagraph"/>
+        <w:pStyle w:val="a9"/>
         <w:numPr>
           <w:ilvl w:val="0"/>
           <w:numId w:val="21"/>
@@ -4663,9 +5310,12 @@
     </w:p>
     <w:p>
       <w:pPr>
-        <w:jc w:val="both"/>
-        <w:rPr>
-          <w:rFonts w:ascii="Century Schoolbook" w:hAnsi="Century Schoolbook"/>
+        <w:ind w:left="360"/>
+        <w:jc w:val="both"/>
+        <w:rPr>
+          <w:rFonts w:ascii="Century Schoolbook" w:hAnsi="Century Schoolbook"/>
+          <w:b/>
+          <w:bCs/>
         </w:rPr>
       </w:pPr>
       <w:r>
@@ -4676,6 +5326,101 @@
         </w:rPr>
         <w:t>Answer:</w:t>
       </w:r>
+      <w:r>
+        <w:rPr>
+          <w:rFonts w:ascii="新細明體" w:eastAsia="新細明體" w:hAnsi="新細明體" w:cs="新細明體"/>
+          <w:b/>
+          <w:bCs/>
+          <w:kern w:val="0"/>
+          <w:sz w:val="24"/>
+          <w:szCs w:val="24"/>
+          <w14:ligatures w14:val="none"/>
+        </w:rPr>
+        <w:t xml:space="preserve"> </w:t>
+      </w:r>
+    </w:p>
+    <w:p>
+      <w:pPr>
+        <w:numPr>
+          <w:ilvl w:val="0"/>
+          <w:numId w:val="25"/>
+        </w:numPr>
+        <w:jc w:val="both"/>
+        <w:rPr>
+          <w:rFonts w:ascii="Century Schoolbook" w:hAnsi="Century Schoolbook"/>
+          <w:b/>
+          <w:bCs/>
+        </w:rPr>
+      </w:pPr>
+      <w:r>
+        <w:rPr>
+          <w:rFonts w:ascii="Century Schoolbook" w:hAnsi="Century Schoolbook"/>
+          <w:b/>
+          <w:bCs/>
+        </w:rPr>
+        <w:t>t-SNE and UMAP usually show clearer and more separated clusters for the four document categories, while PCA often shows more overlap around the center.</w:t>
+      </w:r>
+    </w:p>
+    <w:p>
+      <w:pPr>
+        <w:numPr>
+          <w:ilvl w:val="0"/>
+          <w:numId w:val="25"/>
+        </w:numPr>
+        <w:jc w:val="both"/>
+        <w:rPr>
+          <w:rFonts w:ascii="Century Schoolbook" w:hAnsi="Century Schoolbook"/>
+          <w:b/>
+          <w:bCs/>
+        </w:rPr>
+      </w:pPr>
+      <w:r>
+        <w:rPr>
+          <w:rFonts w:ascii="Century Schoolbook" w:hAnsi="Century Schoolbook"/>
+          <w:b/>
+          <w:bCs/>
+        </w:rPr>
+        <w:t>PCA is a linear method that focuses on keeping the largest variance in the data. However, text data is high-dimensional and sparse, with complex relationships between words. t-SNE and UMAP are non-linear methods that can better preserve local relationships, making clusters easier to separate.</w:t>
+      </w:r>
+    </w:p>
+    <w:p>
+      <w:pPr>
+        <w:numPr>
+          <w:ilvl w:val="0"/>
+          <w:numId w:val="25"/>
+        </w:numPr>
+        <w:jc w:val="both"/>
+        <w:rPr>
+          <w:rFonts w:ascii="Century Schoolbook" w:hAnsi="Century Schoolbook"/>
+          <w:b/>
+          <w:bCs/>
+        </w:rPr>
+      </w:pPr>
+      <w:r>
+        <w:rPr>
+          <w:rFonts w:ascii="Century Schoolbook" w:hAnsi="Century Schoolbook"/>
+          <w:b/>
+          <w:bCs/>
+        </w:rPr>
+        <w:t xml:space="preserve">t-SNE focuses on preserving local similarities rather than global distances. Therefore, the distance between two clusters in a t-SNE plot </w:t>
+      </w:r>
+      <w:r>
+        <w:rPr>
+          <w:rFonts w:ascii="Century Schoolbook" w:hAnsi="Century Schoolbook"/>
+          <w:b/>
+          <w:bCs/>
+        </w:rPr>
+        <w:lastRenderedPageBreak/>
+        <w:t>does not always represent their actual distance in the original high-dimensional data.</w:t>
+      </w:r>
+    </w:p>
+    <w:p>
+      <w:pPr>
+        <w:jc w:val="both"/>
+        <w:rPr>
+          <w:rFonts w:ascii="Century Schoolbook" w:hAnsi="Century Schoolbook"/>
+        </w:rPr>
+      </w:pPr>
     </w:p>
     <w:p>
       <w:pPr>
@@ -4696,14 +5441,14 @@
         <w:rPr>
           <w:rFonts w:ascii="Century Schoolbook" w:hAnsi="Century Schoolbook"/>
         </w:rPr>
-        <w:t xml:space="preserve"> Yes / No </w:t>
-      </w:r>
-    </w:p>
-    <w:p>
-      <w:pPr>
-        <w:jc w:val="both"/>
-        <w:rPr>
-          <w:rFonts w:ascii="Century Schoolbook" w:hAnsi="Century Schoolbook"/>
+        <w:t xml:space="preserve"> Yes </w:t>
+      </w:r>
+    </w:p>
+    <w:p>
+      <w:pPr>
+        <w:jc w:val="both"/>
+        <w:rPr>
+          <w:rFonts w:ascii="Century Schoolbook" w:hAnsi="Century Schoolbook" w:hint="eastAsia"/>
         </w:rPr>
       </w:pPr>
       <w:r>
@@ -4720,6 +5465,12 @@
         </w:rPr>
         <w:t xml:space="preserve"> </w:t>
       </w:r>
+      <w:r>
+        <w:rPr>
+          <w:rFonts w:ascii="Century Schoolbook" w:hAnsi="Century Schoolbook"/>
+        </w:rPr>
+        <w:t>I used ChatGPT to help explain the differences between PCA, t-SNE, and UMAP and to organize my answers in English.</w:t>
+      </w:r>
     </w:p>
     <w:p>
       <w:pPr>
@@ -4742,59 +5493,35 @@
         </w:rPr>
         <w:t xml:space="preserve"> </w:t>
       </w:r>
-    </w:p>
-    <w:p>
-      <w:pPr>
-        <w:jc w:val="both"/>
-        <w:rPr>
-          <w:rFonts w:ascii="Century Schoolbook" w:hAnsi="Century Schoolbook"/>
-        </w:rPr>
-      </w:pPr>
-    </w:p>
-    <w:p>
-      <w:pPr>
-        <w:jc w:val="both"/>
-        <w:rPr>
-          <w:rFonts w:ascii="Century Schoolbook" w:hAnsi="Century Schoolbook"/>
-        </w:rPr>
-      </w:pPr>
-    </w:p>
-    <w:p>
-      <w:pPr>
-        <w:jc w:val="both"/>
-        <w:rPr>
-          <w:rFonts w:ascii="Century Schoolbook" w:hAnsi="Century Schoolbook"/>
-        </w:rPr>
-      </w:pPr>
-    </w:p>
-    <w:p>
-      <w:pPr>
-        <w:jc w:val="both"/>
-        <w:rPr>
-          <w:rFonts w:ascii="Century Schoolbook" w:hAnsi="Century Schoolbook"/>
-        </w:rPr>
-      </w:pPr>
-    </w:p>
-    <w:p>
-      <w:pPr>
-        <w:jc w:val="both"/>
-        <w:rPr>
-          <w:rFonts w:ascii="Century Schoolbook" w:hAnsi="Century Schoolbook"/>
-        </w:rPr>
-      </w:pPr>
-    </w:p>
-    <w:p>
-      <w:pPr>
-        <w:jc w:val="both"/>
-        <w:rPr>
-          <w:rFonts w:ascii="Century Schoolbook" w:hAnsi="Century Schoolbook"/>
-        </w:rPr>
-      </w:pPr>
-      <w:r>
-        <w:rPr>
-          <w:rFonts w:ascii="Century Schoolbook" w:hAnsi="Century Schoolbook"/>
-        </w:rPr>
-        <w:lastRenderedPageBreak/>
+      <w:hyperlink r:id="rId12" w:history="1">
+        <w:r>
+          <w:rPr>
+            <w:rStyle w:val="af2"/>
+            <w:rFonts w:ascii="Century Schoolbook" w:hAnsi="Century Schoolbook"/>
+          </w:rPr>
+          <w:t>https://scikit-learn.org/stable/modules/manifold.html</w:t>
+        </w:r>
+      </w:hyperlink>
+    </w:p>
+    <w:p>
+      <w:pPr>
+        <w:jc w:val="both"/>
+        <w:rPr>
+          <w:rFonts w:ascii="Century Schoolbook" w:hAnsi="Century Schoolbook" w:hint="eastAsia"/>
+        </w:rPr>
+      </w:pPr>
+    </w:p>
+    <w:p>
+      <w:pPr>
+        <w:jc w:val="both"/>
+        <w:rPr>
+          <w:rFonts w:ascii="Century Schoolbook" w:hAnsi="Century Schoolbook"/>
+        </w:rPr>
+      </w:pPr>
+      <w:r>
+        <w:rPr>
+          <w:rFonts w:ascii="Century Schoolbook" w:hAnsi="Century Schoolbook"/>
+        </w:rPr>
         <w:pict w14:anchorId="3E56138F">
           <v:rect id="_x0000_i1036" style="width:0;height:1.5pt" o:hralign="center" o:hrstd="t" o:hr="t" fillcolor="#a0a0a0" stroked="f"/>
         </w:pict>
@@ -4877,7 +5604,6 @@
         </w:rPr>
         <w:t xml:space="preserve"> (integers 0, 1, 2, 3). Then look at the output of </w:t>
       </w:r>
-      <w:proofErr w:type="spellStart"/>
       <w:r>
         <w:rPr>
           <w:rFonts w:ascii="Century Schoolbook" w:hAnsi="Century Schoolbook"/>
@@ -4886,7 +5612,6 @@
         </w:rPr>
         <w:t>LabelBinarizer</w:t>
       </w:r>
-      <w:proofErr w:type="spellEnd"/>
       <w:r>
         <w:rPr>
           <w:rFonts w:ascii="Century Schoolbook" w:hAnsi="Century Schoolbook"/>
@@ -4912,7 +5637,7 @@
     </w:p>
     <w:p>
       <w:pPr>
-        <w:pStyle w:val="ListParagraph"/>
+        <w:pStyle w:val="a9"/>
         <w:numPr>
           <w:ilvl w:val="0"/>
           <w:numId w:val="23"/>
@@ -4931,7 +5656,7 @@
     </w:p>
     <w:p>
       <w:pPr>
-        <w:pStyle w:val="ListParagraph"/>
+        <w:pStyle w:val="a9"/>
         <w:numPr>
           <w:ilvl w:val="0"/>
           <w:numId w:val="23"/>
@@ -4964,7 +5689,7 @@
     </w:p>
     <w:p>
       <w:pPr>
-        <w:pStyle w:val="ListParagraph"/>
+        <w:pStyle w:val="a9"/>
         <w:numPr>
           <w:ilvl w:val="0"/>
           <w:numId w:val="23"/>
@@ -4983,18 +5708,20 @@
     </w:p>
     <w:p>
       <w:pPr>
-        <w:pStyle w:val="ListParagraph"/>
-        <w:jc w:val="both"/>
-        <w:rPr>
-          <w:rFonts w:ascii="Century Schoolbook" w:hAnsi="Century Schoolbook"/>
-        </w:rPr>
-      </w:pPr>
-    </w:p>
-    <w:p>
-      <w:pPr>
-        <w:jc w:val="both"/>
-        <w:rPr>
-          <w:rFonts w:ascii="Century Schoolbook" w:hAnsi="Century Schoolbook"/>
+        <w:pStyle w:val="a9"/>
+        <w:jc w:val="both"/>
+        <w:rPr>
+          <w:rFonts w:ascii="Century Schoolbook" w:hAnsi="Century Schoolbook"/>
+        </w:rPr>
+      </w:pPr>
+    </w:p>
+    <w:p>
+      <w:pPr>
+        <w:jc w:val="both"/>
+        <w:rPr>
+          <w:rFonts w:ascii="Century Schoolbook" w:hAnsi="Century Schoolbook"/>
+          <w:b/>
+          <w:bCs/>
         </w:rPr>
       </w:pPr>
       <w:r>
@@ -5005,6 +5732,92 @@
         </w:rPr>
         <w:t>Answer:</w:t>
       </w:r>
+      <w:r>
+        <w:rPr>
+          <w:rFonts w:ascii="新細明體" w:eastAsia="新細明體" w:hAnsi="新細明體" w:cs="新細明體"/>
+          <w:b/>
+          <w:bCs/>
+          <w:kern w:val="0"/>
+          <w:sz w:val="24"/>
+          <w:szCs w:val="24"/>
+          <w14:ligatures w14:val="none"/>
+        </w:rPr>
+        <w:t xml:space="preserve"> </w:t>
+      </w:r>
+    </w:p>
+    <w:p>
+      <w:pPr>
+        <w:numPr>
+          <w:ilvl w:val="0"/>
+          <w:numId w:val="26"/>
+        </w:numPr>
+        <w:jc w:val="both"/>
+        <w:rPr>
+          <w:rFonts w:ascii="Century Schoolbook" w:hAnsi="Century Schoolbook"/>
+          <w:b/>
+          <w:bCs/>
+        </w:rPr>
+      </w:pPr>
+      <w:r>
+        <w:rPr>
+          <w:rFonts w:ascii="Century Schoolbook" w:hAnsi="Century Schoolbook"/>
+          <w:b/>
+          <w:bCs/>
+        </w:rPr>
+        <w:t>Four binary columns are created to represent the four categories. Each category has one column with a value of 1, while the other columns have a value of 0.</w:t>
+      </w:r>
+    </w:p>
+    <w:p>
+      <w:pPr>
+        <w:numPr>
+          <w:ilvl w:val="0"/>
+          <w:numId w:val="26"/>
+        </w:numPr>
+        <w:jc w:val="both"/>
+        <w:rPr>
+          <w:rFonts w:ascii="Century Schoolbook" w:hAnsi="Century Schoolbook"/>
+          <w:b/>
+          <w:bCs/>
+        </w:rPr>
+      </w:pPr>
+      <w:r>
+        <w:rPr>
+          <w:rFonts w:ascii="Century Schoolbook" w:hAnsi="Century Schoolbook"/>
+          <w:b/>
+          <w:bCs/>
+        </w:rPr>
+        <w:t>Using raw integers (0, 1, 2, 3) may cause algorithms to assume that the categories have a meaningful order and numerical distance. For example, category 3 may appear larger than category 1, even though the numbers are only labels.</w:t>
+      </w:r>
+    </w:p>
+    <w:p>
+      <w:pPr>
+        <w:numPr>
+          <w:ilvl w:val="0"/>
+          <w:numId w:val="26"/>
+        </w:numPr>
+        <w:jc w:val="both"/>
+        <w:rPr>
+          <w:rFonts w:ascii="Century Schoolbook" w:hAnsi="Century Schoolbook"/>
+          <w:b/>
+          <w:bCs/>
+        </w:rPr>
+      </w:pPr>
+      <w:r>
+        <w:rPr>
+          <w:rFonts w:ascii="Century Schoolbook" w:hAnsi="Century Schoolbook"/>
+          <w:b/>
+          <w:bCs/>
+        </w:rPr>
+        <w:t>One-hot binarization converts each category into a separate binary vector. This removes the false numerical order and makes all different categories equally distant in the encoded space.</w:t>
+      </w:r>
+    </w:p>
+    <w:p>
+      <w:pPr>
+        <w:jc w:val="both"/>
+        <w:rPr>
+          <w:rFonts w:ascii="Century Schoolbook" w:hAnsi="Century Schoolbook"/>
+        </w:rPr>
+      </w:pPr>
     </w:p>
     <w:p>
       <w:pPr>
@@ -5025,14 +5838,16 @@
         <w:rPr>
           <w:rFonts w:ascii="Century Schoolbook" w:hAnsi="Century Schoolbook"/>
         </w:rPr>
-        <w:t xml:space="preserve"> Yes / No </w:t>
-      </w:r>
-    </w:p>
-    <w:p>
-      <w:pPr>
-        <w:jc w:val="both"/>
-        <w:rPr>
-          <w:rFonts w:ascii="Century Schoolbook" w:hAnsi="Century Schoolbook"/>
+        <w:t xml:space="preserve"> Yes </w:t>
+      </w:r>
+    </w:p>
+    <w:p>
+      <w:pPr>
+        <w:jc w:val="both"/>
+        <w:rPr>
+          <w:rFonts w:ascii="Century Schoolbook" w:hAnsi="Century Schoolbook"/>
+          <w:b/>
+          <w:bCs/>
         </w:rPr>
       </w:pPr>
       <w:r>
@@ -5045,10 +5860,28 @@
       </w:r>
       <w:r>
         <w:rPr>
-          <w:rFonts w:ascii="Century Schoolbook" w:hAnsi="Century Schoolbook"/>
+          <w:rFonts w:ascii="新細明體" w:eastAsia="新細明體" w:hAnsi="新細明體" w:cs="新細明體"/>
+          <w:kern w:val="0"/>
+          <w:sz w:val="24"/>
+          <w:szCs w:val="24"/>
+          <w14:ligatures w14:val="none"/>
         </w:rPr>
         <w:t xml:space="preserve"> </w:t>
       </w:r>
+      <w:r>
+        <w:rPr>
+          <w:rFonts w:ascii="Century Schoolbook" w:hAnsi="Century Schoolbook"/>
+          <w:b/>
+          <w:bCs/>
+        </w:rPr>
+        <w:t>I used ChatGPT to understand one-hot binarization and help write clear English explanations.</w:t>
+      </w:r>
+      <w:r>
+        <w:rPr>
+          <w:rFonts w:ascii="Century Schoolbook" w:hAnsi="Century Schoolbook"/>
+        </w:rPr>
+        <w:t xml:space="preserve"> </w:t>
+      </w:r>
     </w:p>
     <w:p>
       <w:pPr>
@@ -5071,22 +5904,15 @@
         </w:rPr>
         <w:t xml:space="preserve"> </w:t>
       </w:r>
-    </w:p>
-    <w:p>
-      <w:pPr>
-        <w:jc w:val="both"/>
-        <w:rPr>
-          <w:rFonts w:ascii="Century Schoolbook" w:hAnsi="Century Schoolbook"/>
-        </w:rPr>
-      </w:pPr>
-      <w:r>
-        <w:rPr>
-          <w:rFonts w:ascii="Century Schoolbook" w:hAnsi="Century Schoolbook"/>
-        </w:rPr>
-        <w:pict w14:anchorId="07392833">
-          <v:rect id="_x0000_i1037" style="width:0;height:1.5pt" o:hralign="center" o:hrstd="t" o:hr="t" fillcolor="#a0a0a0" stroked="f"/>
-        </w:pict>
-      </w:r>
+      <w:hyperlink r:id="rId13" w:history="1">
+        <w:r>
+          <w:rPr>
+            <w:rStyle w:val="af2"/>
+            <w:rFonts w:ascii="Century Schoolbook" w:hAnsi="Century Schoolbook"/>
+          </w:rPr>
+          <w:t>https://scikit-learn.org/stable/modules/generated/sklearn.preprocessing.LabelBinarizer.html</w:t>
+        </w:r>
+      </w:hyperlink>
     </w:p>
     <w:sectPr>
       <w:pgSz w:w="11906" w:h="16838" w:code="9"/>
@@ -6216,6 +7042,119 @@
     </w:lvl>
   </w:abstractNum>
   <w:abstractNum w:abstractNumId="9" w15:restartNumberingAfterBreak="0">
+    <w:nsid w:val="36AE638B"/>
+    <w:multiLevelType w:val="multilevel"/>
+    <w:tmpl w:val="43849976"/>
+    <w:lvl w:ilvl="0">
+      <w:start w:val="1"/>
+      <w:numFmt w:val="decimal"/>
+      <w:lvlText w:val="%1."/>
+      <w:lvlJc w:val="left"/>
+      <w:pPr>
+        <w:tabs>
+          <w:tab w:val="num" w:pos="720"/>
+        </w:tabs>
+        <w:ind w:left="720" w:hanging="360"/>
+      </w:pPr>
+    </w:lvl>
+    <w:lvl w:ilvl="1" w:tentative="1">
+      <w:start w:val="1"/>
+      <w:numFmt w:val="decimal"/>
+      <w:lvlText w:val="%2."/>
+      <w:lvlJc w:val="left"/>
+      <w:pPr>
+        <w:tabs>
+          <w:tab w:val="num" w:pos="1440"/>
+        </w:tabs>
+        <w:ind w:left="1440" w:hanging="360"/>
+      </w:pPr>
+    </w:lvl>
+    <w:lvl w:ilvl="2" w:tentative="1">
+      <w:start w:val="1"/>
+      <w:numFmt w:val="decimal"/>
+      <w:lvlText w:val="%3."/>
+      <w:lvlJc w:val="left"/>
+      <w:pPr>
+        <w:tabs>
+          <w:tab w:val="num" w:pos="2160"/>
+        </w:tabs>
+        <w:ind w:left="2160" w:hanging="360"/>
+      </w:pPr>
+    </w:lvl>
+    <w:lvl w:ilvl="3" w:tentative="1">
+      <w:start w:val="1"/>
+      <w:numFmt w:val="decimal"/>
+      <w:lvlText w:val="%4."/>
+      <w:lvlJc w:val="left"/>
+      <w:pPr>
+        <w:tabs>
+          <w:tab w:val="num" w:pos="2880"/>
+        </w:tabs>
+        <w:ind w:left="2880" w:hanging="360"/>
+      </w:pPr>
+    </w:lvl>
+    <w:lvl w:ilvl="4" w:tentative="1">
+      <w:start w:val="1"/>
+      <w:numFmt w:val="decimal"/>
+      <w:lvlText w:val="%5."/>
+      <w:lvlJc w:val="left"/>
+      <w:pPr>
+        <w:tabs>
+          <w:tab w:val="num" w:pos="3600"/>
+        </w:tabs>
+        <w:ind w:left="3600" w:hanging="360"/>
+      </w:pPr>
+    </w:lvl>
+    <w:lvl w:ilvl="5" w:tentative="1">
+      <w:start w:val="1"/>
+      <w:numFmt w:val="decimal"/>
+      <w:lvlText w:val="%6."/>
+      <w:lvlJc w:val="left"/>
+      <w:pPr>
+        <w:tabs>
+          <w:tab w:val="num" w:pos="4320"/>
+        </w:tabs>
+        <w:ind w:left="4320" w:hanging="360"/>
+      </w:pPr>
+    </w:lvl>
+    <w:lvl w:ilvl="6" w:tentative="1">
+      <w:start w:val="1"/>
+      <w:numFmt w:val="decimal"/>
+      <w:lvlText w:val="%7."/>
+      <w:lvlJc w:val="left"/>
+      <w:pPr>
+        <w:tabs>
+          <w:tab w:val="num" w:pos="5040"/>
+        </w:tabs>
+        <w:ind w:left="5040" w:hanging="360"/>
+      </w:pPr>
+    </w:lvl>
+    <w:lvl w:ilvl="7" w:tentative="1">
+      <w:start w:val="1"/>
+      <w:numFmt w:val="decimal"/>
+      <w:lvlText w:val="%8."/>
+      <w:lvlJc w:val="left"/>
+      <w:pPr>
+        <w:tabs>
+          <w:tab w:val="num" w:pos="5760"/>
+        </w:tabs>
+        <w:ind w:left="5760" w:hanging="360"/>
+      </w:pPr>
+    </w:lvl>
+    <w:lvl w:ilvl="8" w:tentative="1">
+      <w:start w:val="1"/>
+      <w:numFmt w:val="decimal"/>
+      <w:lvlText w:val="%9."/>
+      <w:lvlJc w:val="left"/>
+      <w:pPr>
+        <w:tabs>
+          <w:tab w:val="num" w:pos="6480"/>
+        </w:tabs>
+        <w:ind w:left="6480" w:hanging="360"/>
+      </w:pPr>
+    </w:lvl>
+  </w:abstractNum>
+  <w:abstractNum w:abstractNumId="10" w15:restartNumberingAfterBreak="0">
     <w:nsid w:val="4A892D1C"/>
     <w:multiLevelType w:val="hybridMultilevel"/>
     <w:tmpl w:val="6A081320"/>
@@ -6349,7 +7288,7 @@
       </w:rPr>
     </w:lvl>
   </w:abstractNum>
-  <w:abstractNum w:abstractNumId="10" w15:restartNumberingAfterBreak="0">
+  <w:abstractNum w:abstractNumId="11" w15:restartNumberingAfterBreak="0">
     <w:nsid w:val="4DD357A6"/>
     <w:multiLevelType w:val="multilevel"/>
     <w:tmpl w:val="707E0AF4"/>
@@ -6462,7 +7401,7 @@
       </w:pPr>
     </w:lvl>
   </w:abstractNum>
-  <w:abstractNum w:abstractNumId="11" w15:restartNumberingAfterBreak="0">
+  <w:abstractNum w:abstractNumId="12" w15:restartNumberingAfterBreak="0">
     <w:nsid w:val="4FA53F13"/>
     <w:multiLevelType w:val="multilevel"/>
     <w:tmpl w:val="143EEEE0"/>
@@ -6575,7 +7514,7 @@
       </w:pPr>
     </w:lvl>
   </w:abstractNum>
-  <w:abstractNum w:abstractNumId="12" w15:restartNumberingAfterBreak="0">
+  <w:abstractNum w:abstractNumId="13" w15:restartNumberingAfterBreak="0">
     <w:nsid w:val="50686C5F"/>
     <w:multiLevelType w:val="multilevel"/>
     <w:tmpl w:val="9F2C0B54"/>
@@ -6688,7 +7627,7 @@
       </w:pPr>
     </w:lvl>
   </w:abstractNum>
-  <w:abstractNum w:abstractNumId="13" w15:restartNumberingAfterBreak="0">
+  <w:abstractNum w:abstractNumId="14" w15:restartNumberingAfterBreak="0">
     <w:nsid w:val="510B6AF3"/>
     <w:multiLevelType w:val="hybridMultilevel"/>
     <w:tmpl w:val="6B0E57B6"/>
@@ -6828,7 +7767,7 @@
       </w:rPr>
     </w:lvl>
   </w:abstractNum>
-  <w:abstractNum w:abstractNumId="14" w15:restartNumberingAfterBreak="0">
+  <w:abstractNum w:abstractNumId="15" w15:restartNumberingAfterBreak="0">
     <w:nsid w:val="576A4380"/>
     <w:multiLevelType w:val="hybridMultilevel"/>
     <w:tmpl w:val="7F86CB26"/>
@@ -6914,7 +7853,7 @@
       </w:pPr>
     </w:lvl>
   </w:abstractNum>
-  <w:abstractNum w:abstractNumId="15" w15:restartNumberingAfterBreak="0">
+  <w:abstractNum w:abstractNumId="16" w15:restartNumberingAfterBreak="0">
     <w:nsid w:val="600745AA"/>
     <w:multiLevelType w:val="hybridMultilevel"/>
     <w:tmpl w:val="7BCE176C"/>
@@ -7054,7 +7993,7 @@
       </w:rPr>
     </w:lvl>
   </w:abstractNum>
-  <w:abstractNum w:abstractNumId="16" w15:restartNumberingAfterBreak="0">
+  <w:abstractNum w:abstractNumId="17" w15:restartNumberingAfterBreak="0">
     <w:nsid w:val="63660093"/>
     <w:multiLevelType w:val="multilevel"/>
     <w:tmpl w:val="487AC5E8"/>
@@ -7167,7 +8106,7 @@
       </w:pPr>
     </w:lvl>
   </w:abstractNum>
-  <w:abstractNum w:abstractNumId="17" w15:restartNumberingAfterBreak="0">
+  <w:abstractNum w:abstractNumId="18" w15:restartNumberingAfterBreak="0">
     <w:nsid w:val="66633041"/>
     <w:multiLevelType w:val="hybridMultilevel"/>
     <w:tmpl w:val="F3BAEAD8"/>
@@ -7307,7 +8246,7 @@
       </w:rPr>
     </w:lvl>
   </w:abstractNum>
-  <w:abstractNum w:abstractNumId="18" w15:restartNumberingAfterBreak="0">
+  <w:abstractNum w:abstractNumId="19" w15:restartNumberingAfterBreak="0">
     <w:nsid w:val="67445AD2"/>
     <w:multiLevelType w:val="hybridMultilevel"/>
     <w:tmpl w:val="C4DE3054"/>
@@ -7447,7 +8386,120 @@
       </w:rPr>
     </w:lvl>
   </w:abstractNum>
-  <w:abstractNum w:abstractNumId="19" w15:restartNumberingAfterBreak="0">
+  <w:abstractNum w:abstractNumId="20" w15:restartNumberingAfterBreak="0">
+    <w:nsid w:val="6E0D3570"/>
+    <w:multiLevelType w:val="multilevel"/>
+    <w:tmpl w:val="9F342DE0"/>
+    <w:lvl w:ilvl="0">
+      <w:start w:val="1"/>
+      <w:numFmt w:val="decimal"/>
+      <w:lvlText w:val="%1."/>
+      <w:lvlJc w:val="left"/>
+      <w:pPr>
+        <w:tabs>
+          <w:tab w:val="num" w:pos="720"/>
+        </w:tabs>
+        <w:ind w:left="720" w:hanging="360"/>
+      </w:pPr>
+    </w:lvl>
+    <w:lvl w:ilvl="1" w:tentative="1">
+      <w:start w:val="1"/>
+      <w:numFmt w:val="decimal"/>
+      <w:lvlText w:val="%2."/>
+      <w:lvlJc w:val="left"/>
+      <w:pPr>
+        <w:tabs>
+          <w:tab w:val="num" w:pos="1440"/>
+        </w:tabs>
+        <w:ind w:left="1440" w:hanging="360"/>
+      </w:pPr>
+    </w:lvl>
+    <w:lvl w:ilvl="2" w:tentative="1">
+      <w:start w:val="1"/>
+      <w:numFmt w:val="decimal"/>
+      <w:lvlText w:val="%3."/>
+      <w:lvlJc w:val="left"/>
+      <w:pPr>
+        <w:tabs>
+          <w:tab w:val="num" w:pos="2160"/>
+        </w:tabs>
+        <w:ind w:left="2160" w:hanging="360"/>
+      </w:pPr>
+    </w:lvl>
+    <w:lvl w:ilvl="3" w:tentative="1">
+      <w:start w:val="1"/>
+      <w:numFmt w:val="decimal"/>
+      <w:lvlText w:val="%4."/>
+      <w:lvlJc w:val="left"/>
+      <w:pPr>
+        <w:tabs>
+          <w:tab w:val="num" w:pos="2880"/>
+        </w:tabs>
+        <w:ind w:left="2880" w:hanging="360"/>
+      </w:pPr>
+    </w:lvl>
+    <w:lvl w:ilvl="4" w:tentative="1">
+      <w:start w:val="1"/>
+      <w:numFmt w:val="decimal"/>
+      <w:lvlText w:val="%5."/>
+      <w:lvlJc w:val="left"/>
+      <w:pPr>
+        <w:tabs>
+          <w:tab w:val="num" w:pos="3600"/>
+        </w:tabs>
+        <w:ind w:left="3600" w:hanging="360"/>
+      </w:pPr>
+    </w:lvl>
+    <w:lvl w:ilvl="5" w:tentative="1">
+      <w:start w:val="1"/>
+      <w:numFmt w:val="decimal"/>
+      <w:lvlText w:val="%6."/>
+      <w:lvlJc w:val="left"/>
+      <w:pPr>
+        <w:tabs>
+          <w:tab w:val="num" w:pos="4320"/>
+        </w:tabs>
+        <w:ind w:left="4320" w:hanging="360"/>
+      </w:pPr>
+    </w:lvl>
+    <w:lvl w:ilvl="6" w:tentative="1">
+      <w:start w:val="1"/>
+      <w:numFmt w:val="decimal"/>
+      <w:lvlText w:val="%7."/>
+      <w:lvlJc w:val="left"/>
+      <w:pPr>
+        <w:tabs>
+          <w:tab w:val="num" w:pos="5040"/>
+        </w:tabs>
+        <w:ind w:left="5040" w:hanging="360"/>
+      </w:pPr>
+    </w:lvl>
+    <w:lvl w:ilvl="7" w:tentative="1">
+      <w:start w:val="1"/>
+      <w:numFmt w:val="decimal"/>
+      <w:lvlText w:val="%8."/>
+      <w:lvlJc w:val="left"/>
+      <w:pPr>
+        <w:tabs>
+          <w:tab w:val="num" w:pos="5760"/>
+        </w:tabs>
+        <w:ind w:left="5760" w:hanging="360"/>
+      </w:pPr>
+    </w:lvl>
+    <w:lvl w:ilvl="8" w:tentative="1">
+      <w:start w:val="1"/>
+      <w:numFmt w:val="decimal"/>
+      <w:lvlText w:val="%9."/>
+      <w:lvlJc w:val="left"/>
+      <w:pPr>
+        <w:tabs>
+          <w:tab w:val="num" w:pos="6480"/>
+        </w:tabs>
+        <w:ind w:left="6480" w:hanging="360"/>
+      </w:pPr>
+    </w:lvl>
+  </w:abstractNum>
+  <w:abstractNum w:abstractNumId="21" w15:restartNumberingAfterBreak="0">
     <w:nsid w:val="6E5869E4"/>
     <w:multiLevelType w:val="multilevel"/>
     <w:tmpl w:val="22AC937C"/>
@@ -7560,7 +8612,7 @@
       </w:pPr>
     </w:lvl>
   </w:abstractNum>
-  <w:abstractNum w:abstractNumId="20" w15:restartNumberingAfterBreak="0">
+  <w:abstractNum w:abstractNumId="22" w15:restartNumberingAfterBreak="0">
     <w:nsid w:val="6F90345B"/>
     <w:multiLevelType w:val="multilevel"/>
     <w:tmpl w:val="76CCD152"/>
@@ -7673,7 +8725,7 @@
       </w:pPr>
     </w:lvl>
   </w:abstractNum>
-  <w:abstractNum w:abstractNumId="21" w15:restartNumberingAfterBreak="0">
+  <w:abstractNum w:abstractNumId="23" w15:restartNumberingAfterBreak="0">
     <w:nsid w:val="745C3AEA"/>
     <w:multiLevelType w:val="hybridMultilevel"/>
     <w:tmpl w:val="AB2AF8BA"/>
@@ -7786,7 +8838,7 @@
       </w:rPr>
     </w:lvl>
   </w:abstractNum>
-  <w:abstractNum w:abstractNumId="22" w15:restartNumberingAfterBreak="0">
+  <w:abstractNum w:abstractNumId="24" w15:restartNumberingAfterBreak="0">
     <w:nsid w:val="755D4AD5"/>
     <w:multiLevelType w:val="multilevel"/>
     <w:tmpl w:val="1AF6A79A"/>
@@ -7935,7 +8987,7 @@
       </w:rPr>
     </w:lvl>
   </w:abstractNum>
-  <w:abstractNum w:abstractNumId="23" w15:restartNumberingAfterBreak="0">
+  <w:abstractNum w:abstractNumId="25" w15:restartNumberingAfterBreak="0">
     <w:nsid w:val="7D601873"/>
     <w:multiLevelType w:val="multilevel"/>
     <w:tmpl w:val="6660EE9E"/>
@@ -8088,13 +9140,13 @@
     <w:abstractNumId w:val="7"/>
   </w:num>
   <w:num w:numId="2" w16cid:durableId="184292703">
-    <w:abstractNumId w:val="12"/>
+    <w:abstractNumId w:val="13"/>
   </w:num>
   <w:num w:numId="3" w16cid:durableId="1575118697">
     <w:abstractNumId w:val="0"/>
   </w:num>
   <w:num w:numId="4" w16cid:durableId="731463887">
-    <w:abstractNumId w:val="22"/>
+    <w:abstractNumId w:val="24"/>
   </w:num>
   <w:num w:numId="5" w16cid:durableId="619185889">
     <w:abstractNumId w:val="2"/>
@@ -8103,46 +9155,46 @@
     <w:abstractNumId w:val="5"/>
   </w:num>
   <w:num w:numId="7" w16cid:durableId="1588727719">
-    <w:abstractNumId w:val="20"/>
+    <w:abstractNumId w:val="22"/>
   </w:num>
   <w:num w:numId="8" w16cid:durableId="533738981">
     <w:abstractNumId w:val="8"/>
   </w:num>
   <w:num w:numId="9" w16cid:durableId="1269434050">
-    <w:abstractNumId w:val="19"/>
+    <w:abstractNumId w:val="21"/>
   </w:num>
   <w:num w:numId="10" w16cid:durableId="1732079054">
-    <w:abstractNumId w:val="16"/>
+    <w:abstractNumId w:val="17"/>
   </w:num>
   <w:num w:numId="11" w16cid:durableId="1035348155">
-    <w:abstractNumId w:val="10"/>
+    <w:abstractNumId w:val="11"/>
   </w:num>
   <w:num w:numId="12" w16cid:durableId="1142964469">
-    <w:abstractNumId w:val="11"/>
+    <w:abstractNumId w:val="12"/>
   </w:num>
   <w:num w:numId="13" w16cid:durableId="1675378421">
-    <w:abstractNumId w:val="23"/>
+    <w:abstractNumId w:val="25"/>
   </w:num>
   <w:num w:numId="14" w16cid:durableId="815490794">
-    <w:abstractNumId w:val="21"/>
+    <w:abstractNumId w:val="23"/>
   </w:num>
   <w:num w:numId="15" w16cid:durableId="1567035629">
     <w:abstractNumId w:val="3"/>
   </w:num>
   <w:num w:numId="16" w16cid:durableId="1944191802">
-    <w:abstractNumId w:val="13"/>
+    <w:abstractNumId w:val="14"/>
   </w:num>
   <w:num w:numId="17" w16cid:durableId="467089125">
-    <w:abstractNumId w:val="15"/>
+    <w:abstractNumId w:val="16"/>
   </w:num>
   <w:num w:numId="18" w16cid:durableId="771702364">
-    <w:abstractNumId w:val="18"/>
+    <w:abstractNumId w:val="19"/>
   </w:num>
   <w:num w:numId="19" w16cid:durableId="893585597">
-    <w:abstractNumId w:val="9"/>
+    <w:abstractNumId w:val="10"/>
   </w:num>
   <w:num w:numId="20" w16cid:durableId="5520643">
-    <w:abstractNumId w:val="14"/>
+    <w:abstractNumId w:val="15"/>
   </w:num>
   <w:num w:numId="21" w16cid:durableId="1673995430">
     <w:abstractNumId w:val="4"/>
@@ -8154,7 +9206,13 @@
     <w:abstractNumId w:val="6"/>
   </w:num>
   <w:num w:numId="24" w16cid:durableId="1413353911">
-    <w:abstractNumId w:val="17"/>
+    <w:abstractNumId w:val="18"/>
+  </w:num>
+  <w:num w:numId="25" w16cid:durableId="1947879595">
+    <w:abstractNumId w:val="9"/>
+  </w:num>
+  <w:num w:numId="26" w16cid:durableId="519780237">
+    <w:abstractNumId w:val="20"/>
   </w:num>
 </w:numbering>
 </file>
@@ -8556,15 +9614,15 @@
     <w:lsdException w:name="Unresolved Mention" w:semiHidden="1" w:unhideWhenUsed="1"/>
     <w:lsdException w:name="Smart Link" w:semiHidden="1" w:unhideWhenUsed="1"/>
   </w:latentStyles>
-  <w:style w:type="paragraph" w:default="1" w:styleId="Normal">
+  <w:style w:type="paragraph" w:default="1" w:styleId="a">
     <w:name w:val="Normal"/>
     <w:qFormat/>
   </w:style>
-  <w:style w:type="paragraph" w:styleId="Heading1">
+  <w:style w:type="paragraph" w:styleId="1">
     <w:name w:val="heading 1"/>
-    <w:basedOn w:val="Normal"/>
-    <w:next w:val="Normal"/>
-    <w:link w:val="Heading1Char"/>
+    <w:basedOn w:val="a"/>
+    <w:next w:val="a"/>
+    <w:link w:val="10"/>
     <w:uiPriority w:val="9"/>
     <w:qFormat/>
     <w:rsid w:val="0018685D"/>
@@ -8581,11 +9639,11 @@
       <w:szCs w:val="40"/>
     </w:rPr>
   </w:style>
-  <w:style w:type="paragraph" w:styleId="Heading2">
+  <w:style w:type="paragraph" w:styleId="2">
     <w:name w:val="heading 2"/>
-    <w:basedOn w:val="Normal"/>
-    <w:next w:val="Normal"/>
-    <w:link w:val="Heading2Char"/>
+    <w:basedOn w:val="a"/>
+    <w:next w:val="a"/>
+    <w:link w:val="20"/>
     <w:uiPriority w:val="9"/>
     <w:semiHidden/>
     <w:unhideWhenUsed/>
@@ -8604,11 +9662,11 @@
       <w:szCs w:val="32"/>
     </w:rPr>
   </w:style>
-  <w:style w:type="paragraph" w:styleId="Heading3">
+  <w:style w:type="paragraph" w:styleId="3">
     <w:name w:val="heading 3"/>
-    <w:basedOn w:val="Normal"/>
-    <w:next w:val="Normal"/>
-    <w:link w:val="Heading3Char"/>
+    <w:basedOn w:val="a"/>
+    <w:next w:val="a"/>
+    <w:link w:val="30"/>
     <w:uiPriority w:val="9"/>
     <w:semiHidden/>
     <w:unhideWhenUsed/>
@@ -8627,11 +9685,11 @@
       <w:szCs w:val="28"/>
     </w:rPr>
   </w:style>
-  <w:style w:type="paragraph" w:styleId="Heading4">
+  <w:style w:type="paragraph" w:styleId="4">
     <w:name w:val="heading 4"/>
-    <w:basedOn w:val="Normal"/>
-    <w:next w:val="Normal"/>
-    <w:link w:val="Heading4Char"/>
+    <w:basedOn w:val="a"/>
+    <w:next w:val="a"/>
+    <w:link w:val="40"/>
     <w:uiPriority w:val="9"/>
     <w:semiHidden/>
     <w:unhideWhenUsed/>
@@ -8650,11 +9708,11 @@
       <w:color w:val="0F4761" w:themeColor="accent1" w:themeShade="BF"/>
     </w:rPr>
   </w:style>
-  <w:style w:type="paragraph" w:styleId="Heading5">
+  <w:style w:type="paragraph" w:styleId="5">
     <w:name w:val="heading 5"/>
-    <w:basedOn w:val="Normal"/>
-    <w:next w:val="Normal"/>
-    <w:link w:val="Heading5Char"/>
+    <w:basedOn w:val="a"/>
+    <w:next w:val="a"/>
+    <w:link w:val="50"/>
     <w:uiPriority w:val="9"/>
     <w:semiHidden/>
     <w:unhideWhenUsed/>
@@ -8671,11 +9729,11 @@
       <w:color w:val="0F4761" w:themeColor="accent1" w:themeShade="BF"/>
     </w:rPr>
   </w:style>
-  <w:style w:type="paragraph" w:styleId="Heading6">
+  <w:style w:type="paragraph" w:styleId="6">
     <w:name w:val="heading 6"/>
-    <w:basedOn w:val="Normal"/>
-    <w:next w:val="Normal"/>
-    <w:link w:val="Heading6Char"/>
+    <w:basedOn w:val="a"/>
+    <w:next w:val="a"/>
+    <w:link w:val="60"/>
     <w:uiPriority w:val="9"/>
     <w:semiHidden/>
     <w:unhideWhenUsed/>
@@ -8694,11 +9752,11 @@
       <w:color w:val="595959" w:themeColor="text1" w:themeTint="A6"/>
     </w:rPr>
   </w:style>
-  <w:style w:type="paragraph" w:styleId="Heading7">
+  <w:style w:type="paragraph" w:styleId="7">
     <w:name w:val="heading 7"/>
-    <w:basedOn w:val="Normal"/>
-    <w:next w:val="Normal"/>
-    <w:link w:val="Heading7Char"/>
+    <w:basedOn w:val="a"/>
+    <w:next w:val="a"/>
+    <w:link w:val="70"/>
     <w:uiPriority w:val="9"/>
     <w:semiHidden/>
     <w:unhideWhenUsed/>
@@ -8715,11 +9773,11 @@
       <w:color w:val="595959" w:themeColor="text1" w:themeTint="A6"/>
     </w:rPr>
   </w:style>
-  <w:style w:type="paragraph" w:styleId="Heading8">
+  <w:style w:type="paragraph" w:styleId="8">
     <w:name w:val="heading 8"/>
-    <w:basedOn w:val="Normal"/>
-    <w:next w:val="Normal"/>
-    <w:link w:val="Heading8Char"/>
+    <w:basedOn w:val="a"/>
+    <w:next w:val="a"/>
+    <w:link w:val="80"/>
     <w:uiPriority w:val="9"/>
     <w:semiHidden/>
     <w:unhideWhenUsed/>
@@ -8738,11 +9796,11 @@
       <w:color w:val="272727" w:themeColor="text1" w:themeTint="D8"/>
     </w:rPr>
   </w:style>
-  <w:style w:type="paragraph" w:styleId="Heading9">
+  <w:style w:type="paragraph" w:styleId="9">
     <w:name w:val="heading 9"/>
-    <w:basedOn w:val="Normal"/>
-    <w:next w:val="Normal"/>
-    <w:link w:val="Heading9Char"/>
+    <w:basedOn w:val="a"/>
+    <w:next w:val="a"/>
+    <w:link w:val="90"/>
     <w:uiPriority w:val="9"/>
     <w:semiHidden/>
     <w:unhideWhenUsed/>
@@ -8759,12 +9817,12 @@
       <w:color w:val="272727" w:themeColor="text1" w:themeTint="D8"/>
     </w:rPr>
   </w:style>
-  <w:style w:type="character" w:default="1" w:styleId="DefaultParagraphFont">
+  <w:style w:type="character" w:default="1" w:styleId="a0">
     <w:name w:val="Default Paragraph Font"/>
     <w:uiPriority w:val="1"/>
     <w:unhideWhenUsed/>
   </w:style>
-  <w:style w:type="table" w:default="1" w:styleId="TableNormal">
+  <w:style w:type="table" w:default="1" w:styleId="a1">
     <w:name w:val="Normal Table"/>
     <w:uiPriority w:val="99"/>
     <w:semiHidden/>
@@ -8779,16 +9837,16 @@
       </w:tblCellMar>
     </w:tblPr>
   </w:style>
-  <w:style w:type="numbering" w:default="1" w:styleId="NoList">
+  <w:style w:type="numbering" w:default="1" w:styleId="a2">
     <w:name w:val="No List"/>
     <w:uiPriority w:val="99"/>
     <w:semiHidden/>
     <w:unhideWhenUsed/>
   </w:style>
-  <w:style w:type="character" w:customStyle="1" w:styleId="Heading1Char">
-    <w:name w:val="Heading 1 Char"/>
-    <w:basedOn w:val="DefaultParagraphFont"/>
-    <w:link w:val="Heading1"/>
+  <w:style w:type="character" w:customStyle="1" w:styleId="10">
+    <w:name w:val="標題 1 字元"/>
+    <w:basedOn w:val="a0"/>
+    <w:link w:val="1"/>
     <w:uiPriority w:val="9"/>
     <w:rsid w:val="0018685D"/>
     <w:rPr>
@@ -8798,10 +9856,10 @@
       <w:szCs w:val="40"/>
     </w:rPr>
   </w:style>
-  <w:style w:type="character" w:customStyle="1" w:styleId="Heading2Char">
-    <w:name w:val="Heading 2 Char"/>
-    <w:basedOn w:val="DefaultParagraphFont"/>
-    <w:link w:val="Heading2"/>
+  <w:style w:type="character" w:customStyle="1" w:styleId="20">
+    <w:name w:val="標題 2 字元"/>
+    <w:basedOn w:val="a0"/>
+    <w:link w:val="2"/>
     <w:uiPriority w:val="9"/>
     <w:semiHidden/>
     <w:rsid w:val="0018685D"/>
@@ -8812,10 +9870,10 @@
       <w:szCs w:val="32"/>
     </w:rPr>
   </w:style>
-  <w:style w:type="character" w:customStyle="1" w:styleId="Heading3Char">
-    <w:name w:val="Heading 3 Char"/>
-    <w:basedOn w:val="DefaultParagraphFont"/>
-    <w:link w:val="Heading3"/>
+  <w:style w:type="character" w:customStyle="1" w:styleId="30">
+    <w:name w:val="標題 3 字元"/>
+    <w:basedOn w:val="a0"/>
+    <w:link w:val="3"/>
     <w:uiPriority w:val="9"/>
     <w:semiHidden/>
     <w:rsid w:val="0018685D"/>
@@ -8826,10 +9884,10 @@
       <w:szCs w:val="28"/>
     </w:rPr>
   </w:style>
-  <w:style w:type="character" w:customStyle="1" w:styleId="Heading4Char">
-    <w:name w:val="Heading 4 Char"/>
-    <w:basedOn w:val="DefaultParagraphFont"/>
-    <w:link w:val="Heading4"/>
+  <w:style w:type="character" w:customStyle="1" w:styleId="40">
+    <w:name w:val="標題 4 字元"/>
+    <w:basedOn w:val="a0"/>
+    <w:link w:val="4"/>
     <w:uiPriority w:val="9"/>
     <w:semiHidden/>
     <w:rsid w:val="0018685D"/>
@@ -8840,10 +9898,10 @@
       <w:color w:val="0F4761" w:themeColor="accent1" w:themeShade="BF"/>
     </w:rPr>
   </w:style>
-  <w:style w:type="character" w:customStyle="1" w:styleId="Heading5Char">
-    <w:name w:val="Heading 5 Char"/>
-    <w:basedOn w:val="DefaultParagraphFont"/>
-    <w:link w:val="Heading5"/>
+  <w:style w:type="character" w:customStyle="1" w:styleId="50">
+    <w:name w:val="標題 5 字元"/>
+    <w:basedOn w:val="a0"/>
+    <w:link w:val="5"/>
     <w:uiPriority w:val="9"/>
     <w:semiHidden/>
     <w:rsid w:val="0018685D"/>
@@ -8852,10 +9910,10 @@
       <w:color w:val="0F4761" w:themeColor="accent1" w:themeShade="BF"/>
     </w:rPr>
   </w:style>
-  <w:style w:type="character" w:customStyle="1" w:styleId="Heading6Char">
-    <w:name w:val="Heading 6 Char"/>
-    <w:basedOn w:val="DefaultParagraphFont"/>
-    <w:link w:val="Heading6"/>
+  <w:style w:type="character" w:customStyle="1" w:styleId="60">
+    <w:name w:val="標題 6 字元"/>
+    <w:basedOn w:val="a0"/>
+    <w:link w:val="6"/>
     <w:uiPriority w:val="9"/>
     <w:semiHidden/>
     <w:rsid w:val="0018685D"/>
@@ -8866,10 +9924,10 @@
       <w:color w:val="595959" w:themeColor="text1" w:themeTint="A6"/>
     </w:rPr>
   </w:style>
-  <w:style w:type="character" w:customStyle="1" w:styleId="Heading7Char">
-    <w:name w:val="Heading 7 Char"/>
-    <w:basedOn w:val="DefaultParagraphFont"/>
-    <w:link w:val="Heading7"/>
+  <w:style w:type="character" w:customStyle="1" w:styleId="70">
+    <w:name w:val="標題 7 字元"/>
+    <w:basedOn w:val="a0"/>
+    <w:link w:val="7"/>
     <w:uiPriority w:val="9"/>
     <w:semiHidden/>
     <w:rsid w:val="0018685D"/>
@@ -8878,10 +9936,10 @@
       <w:color w:val="595959" w:themeColor="text1" w:themeTint="A6"/>
     </w:rPr>
   </w:style>
-  <w:style w:type="character" w:customStyle="1" w:styleId="Heading8Char">
-    <w:name w:val="Heading 8 Char"/>
-    <w:basedOn w:val="DefaultParagraphFont"/>
-    <w:link w:val="Heading8"/>
+  <w:style w:type="character" w:customStyle="1" w:styleId="80">
+    <w:name w:val="標題 8 字元"/>
+    <w:basedOn w:val="a0"/>
+    <w:link w:val="8"/>
     <w:uiPriority w:val="9"/>
     <w:semiHidden/>
     <w:rsid w:val="0018685D"/>
@@ -8892,10 +9950,10 @@
       <w:color w:val="272727" w:themeColor="text1" w:themeTint="D8"/>
     </w:rPr>
   </w:style>
-  <w:style w:type="character" w:customStyle="1" w:styleId="Heading9Char">
-    <w:name w:val="Heading 9 Char"/>
-    <w:basedOn w:val="DefaultParagraphFont"/>
-    <w:link w:val="Heading9"/>
+  <w:style w:type="character" w:customStyle="1" w:styleId="90">
+    <w:name w:val="標題 9 字元"/>
+    <w:basedOn w:val="a0"/>
+    <w:link w:val="9"/>
     <w:uiPriority w:val="9"/>
     <w:semiHidden/>
     <w:rsid w:val="0018685D"/>
@@ -8904,11 +9962,11 @@
       <w:color w:val="272727" w:themeColor="text1" w:themeTint="D8"/>
     </w:rPr>
   </w:style>
-  <w:style w:type="paragraph" w:styleId="Title">
+  <w:style w:type="paragraph" w:styleId="a3">
     <w:name w:val="Title"/>
-    <w:basedOn w:val="Normal"/>
-    <w:next w:val="Normal"/>
-    <w:link w:val="TitleChar"/>
+    <w:basedOn w:val="a"/>
+    <w:next w:val="a"/>
+    <w:link w:val="a4"/>
     <w:uiPriority w:val="10"/>
     <w:qFormat/>
     <w:rsid w:val="0018685D"/>
@@ -8924,10 +9982,10 @@
       <w:szCs w:val="56"/>
     </w:rPr>
   </w:style>
-  <w:style w:type="character" w:customStyle="1" w:styleId="TitleChar">
-    <w:name w:val="Title Char"/>
-    <w:basedOn w:val="DefaultParagraphFont"/>
-    <w:link w:val="Title"/>
+  <w:style w:type="character" w:customStyle="1" w:styleId="a4">
+    <w:name w:val="標題 字元"/>
+    <w:basedOn w:val="a0"/>
+    <w:link w:val="a3"/>
     <w:uiPriority w:val="10"/>
     <w:rsid w:val="0018685D"/>
     <w:rPr>
@@ -8938,11 +9996,11 @@
       <w:szCs w:val="56"/>
     </w:rPr>
   </w:style>
-  <w:style w:type="paragraph" w:styleId="Subtitle">
+  <w:style w:type="paragraph" w:styleId="a5">
     <w:name w:val="Subtitle"/>
-    <w:basedOn w:val="Normal"/>
-    <w:next w:val="Normal"/>
-    <w:link w:val="SubtitleChar"/>
+    <w:basedOn w:val="a"/>
+    <w:next w:val="a"/>
+    <w:link w:val="a6"/>
     <w:uiPriority w:val="11"/>
     <w:qFormat/>
     <w:rsid w:val="0018685D"/>
@@ -8959,10 +10017,10 @@
       <w:szCs w:val="28"/>
     </w:rPr>
   </w:style>
-  <w:style w:type="character" w:customStyle="1" w:styleId="SubtitleChar">
-    <w:name w:val="Subtitle Char"/>
-    <w:basedOn w:val="DefaultParagraphFont"/>
-    <w:link w:val="Subtitle"/>
+  <w:style w:type="character" w:customStyle="1" w:styleId="a6">
+    <w:name w:val="副標題 字元"/>
+    <w:basedOn w:val="a0"/>
+    <w:link w:val="a5"/>
     <w:uiPriority w:val="11"/>
     <w:rsid w:val="0018685D"/>
     <w:rPr>
@@ -8973,11 +10031,11 @@
       <w:szCs w:val="28"/>
     </w:rPr>
   </w:style>
-  <w:style w:type="paragraph" w:styleId="Quote">
+  <w:style w:type="paragraph" w:styleId="a7">
     <w:name w:val="Quote"/>
-    <w:basedOn w:val="Normal"/>
-    <w:next w:val="Normal"/>
-    <w:link w:val="QuoteChar"/>
+    <w:basedOn w:val="a"/>
+    <w:next w:val="a"/>
+    <w:link w:val="a8"/>
     <w:uiPriority w:val="29"/>
     <w:qFormat/>
     <w:rsid w:val="0018685D"/>
@@ -8991,10 +10049,10 @@
       <w:color w:val="404040" w:themeColor="text1" w:themeTint="BF"/>
     </w:rPr>
   </w:style>
-  <w:style w:type="character" w:customStyle="1" w:styleId="QuoteChar">
-    <w:name w:val="Quote Char"/>
-    <w:basedOn w:val="DefaultParagraphFont"/>
-    <w:link w:val="Quote"/>
+  <w:style w:type="character" w:customStyle="1" w:styleId="a8">
+    <w:name w:val="引文 字元"/>
+    <w:basedOn w:val="a0"/>
+    <w:link w:val="a7"/>
     <w:uiPriority w:val="29"/>
     <w:rsid w:val="0018685D"/>
     <w:rPr>
@@ -9003,9 +10061,9 @@
       <w:color w:val="404040" w:themeColor="text1" w:themeTint="BF"/>
     </w:rPr>
   </w:style>
-  <w:style w:type="paragraph" w:styleId="ListParagraph">
+  <w:style w:type="paragraph" w:styleId="a9">
     <w:name w:val="List Paragraph"/>
-    <w:basedOn w:val="Normal"/>
+    <w:basedOn w:val="a"/>
     <w:uiPriority w:val="34"/>
     <w:qFormat/>
     <w:rsid w:val="0018685D"/>
@@ -9014,9 +10072,9 @@
       <w:contextualSpacing/>
     </w:pPr>
   </w:style>
-  <w:style w:type="character" w:styleId="IntenseEmphasis">
+  <w:style w:type="character" w:styleId="aa">
     <w:name w:val="Intense Emphasis"/>
-    <w:basedOn w:val="DefaultParagraphFont"/>
+    <w:basedOn w:val="a0"/>
     <w:uiPriority w:val="21"/>
     <w:qFormat/>
     <w:rsid w:val="0018685D"/>
@@ -9026,11 +10084,11 @@
       <w:color w:val="0F4761" w:themeColor="accent1" w:themeShade="BF"/>
     </w:rPr>
   </w:style>
-  <w:style w:type="paragraph" w:styleId="IntenseQuote">
+  <w:style w:type="paragraph" w:styleId="ab">
     <w:name w:val="Intense Quote"/>
-    <w:basedOn w:val="Normal"/>
-    <w:next w:val="Normal"/>
-    <w:link w:val="IntenseQuoteChar"/>
+    <w:basedOn w:val="a"/>
+    <w:next w:val="a"/>
+    <w:link w:val="ac"/>
     <w:uiPriority w:val="30"/>
     <w:qFormat/>
     <w:rsid w:val="0018685D"/>
@@ -9049,10 +10107,10 @@
       <w:color w:val="0F4761" w:themeColor="accent1" w:themeShade="BF"/>
     </w:rPr>
   </w:style>
-  <w:style w:type="character" w:customStyle="1" w:styleId="IntenseQuoteChar">
-    <w:name w:val="Intense Quote Char"/>
-    <w:basedOn w:val="DefaultParagraphFont"/>
-    <w:link w:val="IntenseQuote"/>
+  <w:style w:type="character" w:customStyle="1" w:styleId="ac">
+    <w:name w:val="鮮明引文 字元"/>
+    <w:basedOn w:val="a0"/>
+    <w:link w:val="ab"/>
     <w:uiPriority w:val="30"/>
     <w:rsid w:val="0018685D"/>
     <w:rPr>
@@ -9061,9 +10119,9 @@
       <w:color w:val="0F4761" w:themeColor="accent1" w:themeShade="BF"/>
     </w:rPr>
   </w:style>
-  <w:style w:type="character" w:styleId="IntenseReference">
+  <w:style w:type="character" w:styleId="ad">
     <w:name w:val="Intense Reference"/>
-    <w:basedOn w:val="DefaultParagraphFont"/>
+    <w:basedOn w:val="a0"/>
     <w:uiPriority w:val="32"/>
     <w:qFormat/>
     <w:rsid w:val="0018685D"/>
@@ -9075,9 +10133,9 @@
       <w:spacing w:val="5"/>
     </w:rPr>
   </w:style>
-  <w:style w:type="paragraph" w:styleId="NormalWeb">
+  <w:style w:type="paragraph" w:styleId="Web">
     <w:name w:val="Normal (Web)"/>
-    <w:basedOn w:val="Normal"/>
+    <w:basedOn w:val="a"/>
     <w:uiPriority w:val="99"/>
     <w:semiHidden/>
     <w:unhideWhenUsed/>
@@ -9094,10 +10152,10 @@
       <w14:ligatures w14:val="none"/>
     </w:rPr>
   </w:style>
-  <w:style w:type="paragraph" w:styleId="Header">
+  <w:style w:type="paragraph" w:styleId="ae">
     <w:name w:val="header"/>
-    <w:basedOn w:val="Normal"/>
-    <w:link w:val="HeaderChar"/>
+    <w:basedOn w:val="a"/>
+    <w:link w:val="af"/>
     <w:uiPriority w:val="99"/>
     <w:unhideWhenUsed/>
     <w:rsid w:val="00B11B3A"/>
@@ -9109,17 +10167,17 @@
       <w:spacing w:after="0" w:line="240" w:lineRule="auto"/>
     </w:pPr>
   </w:style>
-  <w:style w:type="character" w:customStyle="1" w:styleId="HeaderChar">
-    <w:name w:val="Header Char"/>
-    <w:basedOn w:val="DefaultParagraphFont"/>
-    <w:link w:val="Header"/>
+  <w:style w:type="character" w:customStyle="1" w:styleId="af">
+    <w:name w:val="頁首 字元"/>
+    <w:basedOn w:val="a0"/>
+    <w:link w:val="ae"/>
     <w:uiPriority w:val="99"/>
     <w:rsid w:val="00B11B3A"/>
   </w:style>
-  <w:style w:type="paragraph" w:styleId="Footer">
+  <w:style w:type="paragraph" w:styleId="af0">
     <w:name w:val="footer"/>
-    <w:basedOn w:val="Normal"/>
-    <w:link w:val="FooterChar"/>
+    <w:basedOn w:val="a"/>
+    <w:link w:val="af1"/>
     <w:uiPriority w:val="99"/>
     <w:unhideWhenUsed/>
     <w:rsid w:val="00B11B3A"/>
@@ -9131,12 +10189,66 @@
       <w:spacing w:after="0" w:line="240" w:lineRule="auto"/>
     </w:pPr>
   </w:style>
-  <w:style w:type="character" w:customStyle="1" w:styleId="FooterChar">
-    <w:name w:val="Footer Char"/>
-    <w:basedOn w:val="DefaultParagraphFont"/>
-    <w:link w:val="Footer"/>
+  <w:style w:type="character" w:customStyle="1" w:styleId="af1">
+    <w:name w:val="頁尾 字元"/>
+    <w:basedOn w:val="a0"/>
+    <w:link w:val="af0"/>
     <w:uiPriority w:val="99"/>
     <w:rsid w:val="00B11B3A"/>
+  </w:style>
+  <w:style w:type="character" w:styleId="af2">
+    <w:name w:val="Hyperlink"/>
+    <w:basedOn w:val="a0"/>
+    <w:uiPriority w:val="99"/>
+    <w:unhideWhenUsed/>
+    <w:rsid w:val="00C02A36"/>
+    <w:rPr>
+      <w:color w:val="467886" w:themeColor="hyperlink"/>
+      <w:u w:val="single"/>
+    </w:rPr>
+  </w:style>
+  <w:style w:type="character" w:styleId="af3">
+    <w:name w:val="Unresolved Mention"/>
+    <w:basedOn w:val="a0"/>
+    <w:uiPriority w:val="99"/>
+    <w:semiHidden/>
+    <w:unhideWhenUsed/>
+    <w:rsid w:val="00C02A36"/>
+    <w:rPr>
+      <w:color w:val="605E5C"/>
+      <w:shd w:val="clear" w:color="auto" w:fill="E1DFDD"/>
+    </w:rPr>
+  </w:style>
+  <w:style w:type="character" w:styleId="af4">
+    <w:name w:val="FollowedHyperlink"/>
+    <w:basedOn w:val="a0"/>
+    <w:uiPriority w:val="99"/>
+    <w:semiHidden/>
+    <w:unhideWhenUsed/>
+    <w:rsid w:val="00C02A36"/>
+    <w:rPr>
+      <w:color w:val="96607D" w:themeColor="followedHyperlink"/>
+      <w:u w:val="single"/>
+    </w:rPr>
+  </w:style>
+  <w:style w:type="table" w:styleId="af5">
+    <w:name w:val="Table Grid"/>
+    <w:basedOn w:val="a1"/>
+    <w:uiPriority w:val="39"/>
+    <w:rsid w:val="004F2B83"/>
+    <w:pPr>
+      <w:spacing w:after="0" w:line="240" w:lineRule="auto"/>
+    </w:pPr>
+    <w:tblPr>
+      <w:tblBorders>
+        <w:top w:val="single" w:sz="4" w:space="0" w:color="auto"/>
+        <w:left w:val="single" w:sz="4" w:space="0" w:color="auto"/>
+        <w:bottom w:val="single" w:sz="4" w:space="0" w:color="auto"/>
+        <w:right w:val="single" w:sz="4" w:space="0" w:color="auto"/>
+        <w:insideH w:val="single" w:sz="4" w:space="0" w:color="auto"/>
+        <w:insideV w:val="single" w:sz="4" w:space="0" w:color="auto"/>
+      </w:tblBorders>
+    </w:tblPr>
   </w:style>
 </w:styles>
 </file>

</xml_diff>